<commit_message>
Subido última version del capitulo 2
</commit_message>
<xml_diff>
--- a/Capitulo 2 - SISTEMAS DE INFORMACIÓN/Capitulo 2_V1.0.docx
+++ b/Capitulo 2 - SISTEMAS DE INFORMACIÓN/Capitulo 2_V1.0.docx
@@ -61,25 +61,7 @@
           <w:sz w:val="22"/>
           <w:szCs w:val="22"/>
         </w:rPr>
-        <w:t xml:space="preserve">Este capítulo analiza cómo la Inteligencia Artificial Generativa (IAGen) transforma la arquitectura clásica de los sistemas de información, su integración con las plataformas empresariales y web, y el contexto organizacional del caso faro que sirve de hilo conductor al proyecto. Cada sección combina la explicación conceptual con la evidencia de la literatura reciente (Rother, 2025; Haki &amp; Safaei, 2024; </w:t>
-      </w:r>
-      <w:proofErr w:type="spellStart"/>
-      <w:r>
-        <w:rPr>
-          <w:rFonts w:ascii="Arial" w:eastAsia="Arial" w:hAnsi="Arial" w:cs="Arial"/>
-          <w:sz w:val="22"/>
-          <w:szCs w:val="22"/>
-        </w:rPr>
-        <w:t>Jarzębowicz</w:t>
-      </w:r>
-      <w:proofErr w:type="spellEnd"/>
-      <w:r>
-        <w:rPr>
-          <w:rFonts w:ascii="Arial" w:eastAsia="Arial" w:hAnsi="Arial" w:cs="Arial"/>
-          <w:sz w:val="22"/>
-          <w:szCs w:val="22"/>
-        </w:rPr>
-        <w:t xml:space="preserve"> et al., 2025; Wessel et al., 2025; Tewari et al., 2026) y cierra con una síntesis que condensa la idea central antes de avanzar al siguiente tema.</w:t>
+        <w:t>Este capítulo analiza cómo la Inteligencia Artificial Generativa (IAGen) transforma la arquitectura clásica de los sistemas de información, su integración con las plataformas empresariales y web, y el contexto organizacional del caso faro que sirve de hilo conductor al proyecto. Cada sección combina la explicación conceptual con la evidencia de la literatura reciente (Rother, 2025; Haki &amp; Safaei, 2024; Jarzębowicz et al., 2025; Wessel et al., 2025; Tewari et al., 2026) y cierra con una síntesis que condensa la idea central antes de avanzar al siguiente tema.</w:t>
       </w:r>
     </w:p>
     <w:p>
@@ -110,7 +92,6 @@
         </w:rPr>
         <w:t>La integración de la IAGen reconfigura la arquitectura tradicional de los Sistemas de Información (SI) dentro de la pirámide organizacional (Rother, 2025). Tradicionalmente, los TPS (</w:t>
       </w:r>
-      <w:proofErr w:type="spellStart"/>
       <w:r>
         <w:rPr>
           <w:rFonts w:ascii="Arial" w:eastAsia="Arial" w:hAnsi="Arial" w:cs="Arial"/>
@@ -119,9 +100,16 @@
           <w:sz w:val="22"/>
           <w:szCs w:val="22"/>
         </w:rPr>
-        <w:t>Transaction</w:t>
-      </w:r>
-      <w:proofErr w:type="spellEnd"/>
+        <w:t>Transaction Processing Systems</w:t>
+      </w:r>
+      <w:r>
+        <w:rPr>
+          <w:rFonts w:ascii="Arial" w:eastAsia="Arial" w:hAnsi="Arial" w:cs="Arial"/>
+          <w:sz w:val="22"/>
+          <w:szCs w:val="22"/>
+        </w:rPr>
+        <w:t>) y los OAS (</w:t>
+      </w:r>
       <w:r>
         <w:rPr>
           <w:rFonts w:ascii="Arial" w:eastAsia="Arial" w:hAnsi="Arial" w:cs="Arial"/>
@@ -130,9 +118,16 @@
           <w:sz w:val="22"/>
           <w:szCs w:val="22"/>
         </w:rPr>
-        <w:t xml:space="preserve"> Processing </w:t>
-      </w:r>
-      <w:proofErr w:type="spellStart"/>
+        <w:t>Office Automation Systems</w:t>
+      </w:r>
+      <w:r>
+        <w:rPr>
+          <w:rFonts w:ascii="Arial" w:eastAsia="Arial" w:hAnsi="Arial" w:cs="Arial"/>
+          <w:sz w:val="22"/>
+          <w:szCs w:val="22"/>
+        </w:rPr>
+        <w:t>) gestionaban transacciones estructuradas y tareas administrativas; sin embargo, con la llegada de los modelos de lenguaje de gran escala (LLM), estos sistemas se convierten en plataformas de ejecución autónoma capaces de procesar flujos de trabajo dinámicos, automatizar el soporte al usuario y orquestar la gestión documental (Rother, 2025). Los KWS (</w:t>
+      </w:r>
       <w:r>
         <w:rPr>
           <w:rFonts w:ascii="Arial" w:eastAsia="Arial" w:hAnsi="Arial" w:cs="Arial"/>
@@ -141,91 +136,8 @@
           <w:sz w:val="22"/>
           <w:szCs w:val="22"/>
         </w:rPr>
-        <w:t>Systems</w:t>
-      </w:r>
-      <w:proofErr w:type="spellEnd"/>
-      <w:r>
-        <w:rPr>
-          <w:rFonts w:ascii="Arial" w:eastAsia="Arial" w:hAnsi="Arial" w:cs="Arial"/>
-          <w:sz w:val="22"/>
-          <w:szCs w:val="22"/>
-        </w:rPr>
-        <w:t>) y los OAS (</w:t>
-      </w:r>
-      <w:r>
-        <w:rPr>
-          <w:rFonts w:ascii="Arial" w:eastAsia="Arial" w:hAnsi="Arial" w:cs="Arial"/>
-          <w:i/>
-          <w:iCs/>
-          <w:sz w:val="22"/>
-          <w:szCs w:val="22"/>
-        </w:rPr>
-        <w:t xml:space="preserve">Office </w:t>
-      </w:r>
-      <w:proofErr w:type="spellStart"/>
-      <w:r>
-        <w:rPr>
-          <w:rFonts w:ascii="Arial" w:eastAsia="Arial" w:hAnsi="Arial" w:cs="Arial"/>
-          <w:i/>
-          <w:iCs/>
-          <w:sz w:val="22"/>
-          <w:szCs w:val="22"/>
-        </w:rPr>
-        <w:t>Automation</w:t>
-      </w:r>
-      <w:proofErr w:type="spellEnd"/>
-      <w:r>
-        <w:rPr>
-          <w:rFonts w:ascii="Arial" w:eastAsia="Arial" w:hAnsi="Arial" w:cs="Arial"/>
-          <w:i/>
-          <w:iCs/>
-          <w:sz w:val="22"/>
-          <w:szCs w:val="22"/>
-        </w:rPr>
-        <w:t xml:space="preserve"> </w:t>
-      </w:r>
-      <w:proofErr w:type="spellStart"/>
-      <w:r>
-        <w:rPr>
-          <w:rFonts w:ascii="Arial" w:eastAsia="Arial" w:hAnsi="Arial" w:cs="Arial"/>
-          <w:i/>
-          <w:iCs/>
-          <w:sz w:val="22"/>
-          <w:szCs w:val="22"/>
-        </w:rPr>
-        <w:t>Systems</w:t>
-      </w:r>
-      <w:proofErr w:type="spellEnd"/>
-      <w:r>
-        <w:rPr>
-          <w:rFonts w:ascii="Arial" w:eastAsia="Arial" w:hAnsi="Arial" w:cs="Arial"/>
-          <w:sz w:val="22"/>
-          <w:szCs w:val="22"/>
-        </w:rPr>
-        <w:t>) gestionaban transacciones estructuradas y tareas administrativas; sin embargo, con la llegada de los modelos de lenguaje de gran escala (LLM), estos sistemas se convierten en plataformas de ejecución autónoma capaces de procesar flujos de trabajo dinámicos, automatizar el soporte al usuario y orquestar la gestión documental (Rother, 2025). Los KWS (</w:t>
-      </w:r>
-      <w:r>
-        <w:rPr>
-          <w:rFonts w:ascii="Arial" w:eastAsia="Arial" w:hAnsi="Arial" w:cs="Arial"/>
-          <w:i/>
-          <w:iCs/>
-          <w:sz w:val="22"/>
-          <w:szCs w:val="22"/>
-        </w:rPr>
-        <w:t xml:space="preserve">Knowledge Work </w:t>
-      </w:r>
-      <w:proofErr w:type="spellStart"/>
-      <w:r>
-        <w:rPr>
-          <w:rFonts w:ascii="Arial" w:eastAsia="Arial" w:hAnsi="Arial" w:cs="Arial"/>
-          <w:i/>
-          <w:iCs/>
-          <w:sz w:val="22"/>
-          <w:szCs w:val="22"/>
-        </w:rPr>
-        <w:t>Systems</w:t>
-      </w:r>
-      <w:proofErr w:type="spellEnd"/>
+        <w:t>Knowledge Work Systems</w:t>
+      </w:r>
       <w:r>
         <w:rPr>
           <w:rFonts w:ascii="Arial" w:eastAsia="Arial" w:hAnsi="Arial" w:cs="Arial"/>
@@ -246,97 +158,7 @@
           <w:sz w:val="22"/>
           <w:szCs w:val="22"/>
         </w:rPr>
-        <w:t xml:space="preserve">A nivel directivo, la IAGen reinterpreta también los MIS (Management </w:t>
-      </w:r>
-      <w:proofErr w:type="spellStart"/>
-      <w:r>
-        <w:rPr>
-          <w:rFonts w:ascii="Arial" w:eastAsia="Arial" w:hAnsi="Arial" w:cs="Arial"/>
-          <w:sz w:val="22"/>
-          <w:szCs w:val="22"/>
-        </w:rPr>
-        <w:t>Information</w:t>
-      </w:r>
-      <w:proofErr w:type="spellEnd"/>
-      <w:r>
-        <w:rPr>
-          <w:rFonts w:ascii="Arial" w:eastAsia="Arial" w:hAnsi="Arial" w:cs="Arial"/>
-          <w:sz w:val="22"/>
-          <w:szCs w:val="22"/>
-        </w:rPr>
-        <w:t xml:space="preserve"> </w:t>
-      </w:r>
-      <w:proofErr w:type="spellStart"/>
-      <w:r>
-        <w:rPr>
-          <w:rFonts w:ascii="Arial" w:eastAsia="Arial" w:hAnsi="Arial" w:cs="Arial"/>
-          <w:sz w:val="22"/>
-          <w:szCs w:val="22"/>
-        </w:rPr>
-        <w:t>Systems</w:t>
-      </w:r>
-      <w:proofErr w:type="spellEnd"/>
-      <w:r>
-        <w:rPr>
-          <w:rFonts w:ascii="Arial" w:eastAsia="Arial" w:hAnsi="Arial" w:cs="Arial"/>
-          <w:sz w:val="22"/>
-          <w:szCs w:val="22"/>
-        </w:rPr>
-        <w:t>), los DSS (</w:t>
-      </w:r>
-      <w:proofErr w:type="spellStart"/>
-      <w:r>
-        <w:rPr>
-          <w:rFonts w:ascii="Arial" w:eastAsia="Arial" w:hAnsi="Arial" w:cs="Arial"/>
-          <w:sz w:val="22"/>
-          <w:szCs w:val="22"/>
-        </w:rPr>
-        <w:t>Decision</w:t>
-      </w:r>
-      <w:proofErr w:type="spellEnd"/>
-      <w:r>
-        <w:rPr>
-          <w:rFonts w:ascii="Arial" w:eastAsia="Arial" w:hAnsi="Arial" w:cs="Arial"/>
-          <w:sz w:val="22"/>
-          <w:szCs w:val="22"/>
-        </w:rPr>
-        <w:t xml:space="preserve"> </w:t>
-      </w:r>
-      <w:proofErr w:type="spellStart"/>
-      <w:r>
-        <w:rPr>
-          <w:rFonts w:ascii="Arial" w:eastAsia="Arial" w:hAnsi="Arial" w:cs="Arial"/>
-          <w:sz w:val="22"/>
-          <w:szCs w:val="22"/>
-        </w:rPr>
-        <w:t>Support</w:t>
-      </w:r>
-      <w:proofErr w:type="spellEnd"/>
-      <w:r>
-        <w:rPr>
-          <w:rFonts w:ascii="Arial" w:eastAsia="Arial" w:hAnsi="Arial" w:cs="Arial"/>
-          <w:sz w:val="22"/>
-          <w:szCs w:val="22"/>
-        </w:rPr>
-        <w:t xml:space="preserve"> </w:t>
-      </w:r>
-      <w:proofErr w:type="spellStart"/>
-      <w:r>
-        <w:rPr>
-          <w:rFonts w:ascii="Arial" w:eastAsia="Arial" w:hAnsi="Arial" w:cs="Arial"/>
-          <w:sz w:val="22"/>
-          <w:szCs w:val="22"/>
-        </w:rPr>
-        <w:t>Systems</w:t>
-      </w:r>
-      <w:proofErr w:type="spellEnd"/>
-      <w:r>
-        <w:rPr>
-          <w:rFonts w:ascii="Arial" w:eastAsia="Arial" w:hAnsi="Arial" w:cs="Arial"/>
-          <w:sz w:val="22"/>
-          <w:szCs w:val="22"/>
-        </w:rPr>
-        <w:t>) y los sistemas expertos convencionales. En lugar de informes estáticos o reglas de inferencia rígidas basadas en lógica simbólica, la IAGen actúa como una interfaz conversacional e interactiva, capaz de analizar grandes volúmenes de datos no estructurados, generar escenarios explicativos en tiempo real y colaborar dinámicamente con los gestores de TI en la toma de decisiones estratégicas, la gestión de riesgos y la gobernanza organizacional (Rother, 2025). Este desplazamiento —de la regla fija a la interfaz conversacional— es el hilo que conecta a todos los niveles de la pirámide y que se retoma más adelante en la Figura 2.1.</w:t>
+        <w:t>A nivel directivo, la IAGen reinterpreta también los MIS (Management Information Systems), los DSS (Decision Support Systems) y los sistemas expertos convencionales. En lugar de informes estáticos o reglas de inferencia rígidas basadas en lógica simbólica, la IAGen actúa como una interfaz conversacional e interactiva, capaz de analizar grandes volúmenes de datos no estructurados, generar escenarios explicativos en tiempo real y colaborar dinámicamente con los gestores de TI en la toma de decisiones estratégicas, la gestión de riesgos y la gobernanza organizacional (Rother, 2025). Este desplazamiento —de la regla fija a la interfaz conversacional— es el hilo que conecta a todos los niveles de la pirámide y que se retoma más adelante en la Figura 2.1.</w:t>
       </w:r>
     </w:p>
     <w:p>
@@ -495,97 +317,7 @@
           <w:sz w:val="22"/>
           <w:szCs w:val="22"/>
         </w:rPr>
-        <w:t xml:space="preserve">La convergencia de la IAGen con las plataformas empresariales (Enterprise </w:t>
-      </w:r>
-      <w:proofErr w:type="spellStart"/>
-      <w:r>
-        <w:rPr>
-          <w:rFonts w:ascii="Arial" w:eastAsia="Arial" w:hAnsi="Arial" w:cs="Arial"/>
-          <w:sz w:val="22"/>
-          <w:szCs w:val="22"/>
-        </w:rPr>
-        <w:t>Platforms</w:t>
-      </w:r>
-      <w:proofErr w:type="spellEnd"/>
-      <w:r>
-        <w:rPr>
-          <w:rFonts w:ascii="Arial" w:eastAsia="Arial" w:hAnsi="Arial" w:cs="Arial"/>
-          <w:sz w:val="22"/>
-          <w:szCs w:val="22"/>
-        </w:rPr>
-        <w:t xml:space="preserve">) modifica sustancialmente sus dimensiones sociotécnicas: capacidades, arquitectura y gobernanza (Haki &amp; Safaei, 2024). Los sistemas web y de comercio electrónico dejan de ser interfaces estáticas de interacción para convertirse en ecosistemas inteligentes, en los que la automatización flexible y la </w:t>
-      </w:r>
-      <w:proofErr w:type="spellStart"/>
-      <w:r>
-        <w:rPr>
-          <w:rFonts w:ascii="Arial" w:eastAsia="Arial" w:hAnsi="Arial" w:cs="Arial"/>
-          <w:sz w:val="22"/>
-          <w:szCs w:val="22"/>
-        </w:rPr>
-        <w:t>hiperpersonalización</w:t>
-      </w:r>
-      <w:proofErr w:type="spellEnd"/>
-      <w:r>
-        <w:rPr>
-          <w:rFonts w:ascii="Arial" w:eastAsia="Arial" w:hAnsi="Arial" w:cs="Arial"/>
-          <w:sz w:val="22"/>
-          <w:szCs w:val="22"/>
-        </w:rPr>
-        <w:t xml:space="preserve"> optimizan la experiencia de usuarios y clientes (Haki &amp; Safaei, 2024). En las plataformas empresariales integradas —como los ERP o los CRM de gran escala, por </w:t>
-      </w:r>
-      <w:proofErr w:type="gramStart"/>
-      <w:r>
-        <w:rPr>
-          <w:rFonts w:ascii="Arial" w:eastAsia="Arial" w:hAnsi="Arial" w:cs="Arial"/>
-          <w:sz w:val="22"/>
-          <w:szCs w:val="22"/>
-        </w:rPr>
-        <w:t>ejemplo</w:t>
-      </w:r>
-      <w:proofErr w:type="gramEnd"/>
-      <w:r>
-        <w:rPr>
-          <w:rFonts w:ascii="Arial" w:eastAsia="Arial" w:hAnsi="Arial" w:cs="Arial"/>
-          <w:sz w:val="22"/>
-          <w:szCs w:val="22"/>
-        </w:rPr>
-        <w:t xml:space="preserve"> Salesforce o SAP— los recursos limítrofes (</w:t>
-      </w:r>
-      <w:proofErr w:type="spellStart"/>
-      <w:r>
-        <w:rPr>
-          <w:rFonts w:ascii="Arial" w:eastAsia="Arial" w:hAnsi="Arial" w:cs="Arial"/>
-          <w:sz w:val="22"/>
-          <w:szCs w:val="22"/>
-        </w:rPr>
-        <w:t>boundary</w:t>
-      </w:r>
-      <w:proofErr w:type="spellEnd"/>
-      <w:r>
-        <w:rPr>
-          <w:rFonts w:ascii="Arial" w:eastAsia="Arial" w:hAnsi="Arial" w:cs="Arial"/>
-          <w:sz w:val="22"/>
-          <w:szCs w:val="22"/>
-        </w:rPr>
-        <w:t xml:space="preserve"> </w:t>
-      </w:r>
-      <w:proofErr w:type="spellStart"/>
-      <w:r>
-        <w:rPr>
-          <w:rFonts w:ascii="Arial" w:eastAsia="Arial" w:hAnsi="Arial" w:cs="Arial"/>
-          <w:sz w:val="22"/>
-          <w:szCs w:val="22"/>
-        </w:rPr>
-        <w:t>resources</w:t>
-      </w:r>
-      <w:proofErr w:type="spellEnd"/>
-      <w:r>
-        <w:rPr>
-          <w:rFonts w:ascii="Arial" w:eastAsia="Arial" w:hAnsi="Arial" w:cs="Arial"/>
-          <w:sz w:val="22"/>
-          <w:szCs w:val="22"/>
-        </w:rPr>
-        <w:t xml:space="preserve">), tales como las API y los kits de </w:t>
+        <w:t xml:space="preserve">La convergencia de la IAGen con las plataformas empresariales (Enterprise Platforms) modifica sustancialmente sus dimensiones sociotécnicas: capacidades, arquitectura y gobernanza (Haki &amp; Safaei, 2024). Los sistemas web y de comercio electrónico dejan de ser interfaces estáticas de interacción para convertirse en ecosistemas inteligentes, en los que la automatización flexible y la hiperpersonalización optimizan la experiencia de usuarios y clientes (Haki &amp; Safaei, 2024). En las plataformas empresariales integradas —como los ERP o los CRM de gran escala, por ejemplo Salesforce o SAP— los recursos limítrofes (boundary resources), tales como las API y los kits de </w:t>
       </w:r>
       <w:r>
         <w:rPr>
@@ -608,25 +340,7 @@
           <w:sz w:val="22"/>
           <w:szCs w:val="22"/>
         </w:rPr>
-        <w:t>No obstante, esta integración plantea desafíos arquitectónicos y de gobernanza de TI relevantes. Las organizaciones deben estructurar mecanismos para gestionar el uso no regulado de estas herramientas (</w:t>
-      </w:r>
-      <w:proofErr w:type="spellStart"/>
-      <w:r>
-        <w:rPr>
-          <w:rFonts w:ascii="Arial" w:eastAsia="Arial" w:hAnsi="Arial" w:cs="Arial"/>
-          <w:sz w:val="22"/>
-          <w:szCs w:val="22"/>
-        </w:rPr>
-        <w:t>shadow</w:t>
-      </w:r>
-      <w:proofErr w:type="spellEnd"/>
-      <w:r>
-        <w:rPr>
-          <w:rFonts w:ascii="Arial" w:eastAsia="Arial" w:hAnsi="Arial" w:cs="Arial"/>
-          <w:sz w:val="22"/>
-          <w:szCs w:val="22"/>
-        </w:rPr>
-        <w:t xml:space="preserve"> AI), mitigar los riesgos de privacidad, evitar alucinaciones operativas y redefinir las competencias que se exigen a las partes interesadas y a los desarrolladores, con el fin de garantizar la interoperabilidad, la escalabilidad y la soberanía de los datos empresariales en entornos móviles y multicanal (Haki &amp; Safaei, 2024). La Figura 2.2 resume este esquema, situando a la IA Generativa como capa central —un segundo cerebro organizacional— entre las entradas de los sistemas empresariales y las salidas hacia las plataformas digitales.</w:t>
+        <w:t>No obstante, esta integración plantea desafíos arquitectónicos y de gobernanza de TI relevantes. Las organizaciones deben estructurar mecanismos para gestionar el uso no regulado de estas herramientas (shadow AI), mitigar los riesgos de privacidad, evitar alucinaciones operativas y redefinir las competencias que se exigen a las partes interesadas y a los desarrolladores, con el fin de garantizar la interoperabilidad, la escalabilidad y la soberanía de los datos empresariales en entornos móviles y multicanal (Haki &amp; Safaei, 2024). La Figura 2.2 resume este esquema, situando a la IA Generativa como capa central —un segundo cerebro organizacional— entre las entradas de los sistemas empresariales y las salidas hacia las plataformas digitales.</w:t>
       </w:r>
     </w:p>
     <w:p>
@@ -766,29 +480,7 @@
           <w:szCs w:val="22"/>
         </w:rPr>
         <w:lastRenderedPageBreak/>
-        <w:t>nuevos —</w:t>
-      </w:r>
-      <w:proofErr w:type="spellStart"/>
-      <w:r>
-        <w:rPr>
-          <w:rFonts w:ascii="Arial" w:eastAsia="Arial" w:hAnsi="Arial" w:cs="Arial"/>
-          <w:i/>
-          <w:iCs/>
-          <w:sz w:val="22"/>
-          <w:szCs w:val="22"/>
-        </w:rPr>
-        <w:t>shadow</w:t>
-      </w:r>
-      <w:proofErr w:type="spellEnd"/>
-      <w:r>
-        <w:rPr>
-          <w:rFonts w:ascii="Arial" w:eastAsia="Arial" w:hAnsi="Arial" w:cs="Arial"/>
-          <w:i/>
-          <w:iCs/>
-          <w:sz w:val="22"/>
-          <w:szCs w:val="22"/>
-        </w:rPr>
-        <w:t xml:space="preserve"> AI, privacidad y alucinaciones— que no existían en la arquitectura tradicional (Figura 2.2).</w:t>
+        <w:t>nuevos —shadow AI, privacidad y alucinaciones— que no existían en la arquitectura tradicional (Figura 2.2).</w:t>
       </w:r>
     </w:p>
     <w:p>
@@ -817,25 +509,7 @@
           <w:sz w:val="22"/>
           <w:szCs w:val="22"/>
         </w:rPr>
-        <w:t xml:space="preserve">El caso faro aborda el impacto transformador de la IAGen en las plataformas digitales, identificando cómo los mecanismos de automatización inteligente, democratización, </w:t>
-      </w:r>
-      <w:proofErr w:type="spellStart"/>
-      <w:r>
-        <w:rPr>
-          <w:rFonts w:ascii="Arial" w:eastAsia="Arial" w:hAnsi="Arial" w:cs="Arial"/>
-          <w:sz w:val="22"/>
-          <w:szCs w:val="22"/>
-        </w:rPr>
-        <w:t>hiperpersonalización</w:t>
-      </w:r>
-      <w:proofErr w:type="spellEnd"/>
-      <w:r>
-        <w:rPr>
-          <w:rFonts w:ascii="Arial" w:eastAsia="Arial" w:hAnsi="Arial" w:cs="Arial"/>
-          <w:sz w:val="22"/>
-          <w:szCs w:val="22"/>
-        </w:rPr>
-        <w:t xml:space="preserve"> e innovación colaborativa reconfiguran la creación de valor (Wessel et al., 2025). El problema central radica en la necesidad de adaptar la arquitectura y la gobernanza de las plataformas frente a tecnologías probabilísticas capaces de generar contenido y código de forma autónoma, lo que altera las fronteras tradicionales del sistema y expone a las organizaciones a riesgos de sesgo, desinformación y pérdida de control sobre la calidad (Wessel et al., 2025).</w:t>
+        <w:t>El caso faro aborda el impacto transformador de la IAGen en las plataformas digitales, identificando cómo los mecanismos de automatización inteligente, democratización, hiperpersonalización e innovación colaborativa reconfiguran la creación de valor (Wessel et al., 2025). El problema central radica en la necesidad de adaptar la arquitectura y la gobernanza de las plataformas frente a tecnologías probabilísticas capaces de generar contenido y código de forma autónoma, lo que altera las fronteras tradicionales del sistema y expone a las organizaciones a riesgos de sesgo, desinformación y pérdida de control sobre la calidad (Wessel et al., 2025).</w:t>
       </w:r>
     </w:p>
     <w:p>
@@ -877,7 +551,6 @@
         </w:rPr>
         <w:t>Propietarios de la plataforma (</w:t>
       </w:r>
-      <w:proofErr w:type="spellStart"/>
       <w:r>
         <w:rPr>
           <w:rFonts w:ascii="Arial" w:eastAsia="Arial" w:hAnsi="Arial" w:cs="Arial"/>
@@ -887,33 +560,8 @@
           <w:sz w:val="22"/>
           <w:szCs w:val="22"/>
         </w:rPr>
-        <w:t>Platform</w:t>
-      </w:r>
-      <w:proofErr w:type="spellEnd"/>
-      <w:r>
-        <w:rPr>
-          <w:rFonts w:ascii="Arial" w:eastAsia="Arial" w:hAnsi="Arial" w:cs="Arial"/>
-          <w:i/>
-          <w:iCs/>
-          <w:color w:val="000000"/>
-          <w:sz w:val="22"/>
-          <w:szCs w:val="22"/>
-        </w:rPr>
-        <w:t xml:space="preserve"> </w:t>
-      </w:r>
-      <w:proofErr w:type="spellStart"/>
-      <w:r>
-        <w:rPr>
-          <w:rFonts w:ascii="Arial" w:eastAsia="Arial" w:hAnsi="Arial" w:cs="Arial"/>
-          <w:i/>
-          <w:iCs/>
-          <w:color w:val="000000"/>
-          <w:sz w:val="22"/>
-          <w:szCs w:val="22"/>
-        </w:rPr>
-        <w:t>Owners</w:t>
-      </w:r>
-      <w:proofErr w:type="spellEnd"/>
+        <w:t>Platform Owners</w:t>
+      </w:r>
       <w:r>
         <w:rPr>
           <w:rFonts w:ascii="Arial" w:eastAsia="Arial" w:hAnsi="Arial" w:cs="Arial"/>
@@ -940,27 +588,15 @@
         <w:spacing w:after="140"/>
         <w:jc w:val="both"/>
       </w:pPr>
-      <w:proofErr w:type="spellStart"/>
-      <w:r>
-        <w:rPr>
-          <w:rFonts w:ascii="Arial" w:eastAsia="Arial" w:hAnsi="Arial" w:cs="Arial"/>
-          <w:color w:val="000000"/>
-          <w:sz w:val="22"/>
-          <w:szCs w:val="22"/>
-        </w:rPr>
-        <w:t>Complementadores</w:t>
-      </w:r>
-      <w:proofErr w:type="spellEnd"/>
-      <w:r>
-        <w:rPr>
-          <w:rFonts w:ascii="Arial" w:eastAsia="Arial" w:hAnsi="Arial" w:cs="Arial"/>
-          <w:color w:val="000000"/>
-          <w:sz w:val="22"/>
-          <w:szCs w:val="22"/>
-        </w:rPr>
-        <w:t xml:space="preserve"> (</w:t>
-      </w:r>
-      <w:proofErr w:type="spellStart"/>
+      <w:r>
+        <w:rPr>
+          <w:rFonts w:ascii="Arial" w:eastAsia="Arial" w:hAnsi="Arial" w:cs="Arial"/>
+          <w:color w:val="000000"/>
+          <w:sz w:val="22"/>
+          <w:szCs w:val="22"/>
+        </w:rPr>
+        <w:t>Complementadores (</w:t>
+      </w:r>
       <w:r>
         <w:rPr>
           <w:rFonts w:ascii="Arial" w:eastAsia="Arial" w:hAnsi="Arial" w:cs="Arial"/>
@@ -972,7 +608,6 @@
         </w:rPr>
         <w:t>Complementors</w:t>
       </w:r>
-      <w:proofErr w:type="spellEnd"/>
       <w:r>
         <w:rPr>
           <w:rFonts w:ascii="Arial" w:eastAsia="Arial" w:hAnsi="Arial" w:cs="Arial"/>
@@ -1020,25 +655,7 @@
           <w:sz w:val="22"/>
           <w:szCs w:val="22"/>
         </w:rPr>
-        <w:t>La información gestionada abarca datos no estructurados, indicaciones (</w:t>
-      </w:r>
-      <w:proofErr w:type="spellStart"/>
-      <w:r>
-        <w:rPr>
-          <w:rFonts w:ascii="Arial" w:eastAsia="Arial" w:hAnsi="Arial" w:cs="Arial"/>
-          <w:sz w:val="22"/>
-          <w:szCs w:val="22"/>
-        </w:rPr>
-        <w:t>prompts</w:t>
-      </w:r>
-      <w:proofErr w:type="spellEnd"/>
-      <w:r>
-        <w:rPr>
-          <w:rFonts w:ascii="Arial" w:eastAsia="Arial" w:hAnsi="Arial" w:cs="Arial"/>
-          <w:sz w:val="22"/>
-          <w:szCs w:val="22"/>
-        </w:rPr>
-        <w:t>), código fuente, textos sintéticos y métricas de interacción. Los límites del sistema se extienden más allá de las fronteras organizacionales rígidas, integrando a los agentes de IA como cocreadores de valor y exigiendo mecanismos de control estricto sobre la entrada y la salida de datos (Wessel et al., 2025). La Figura 2.3 traduce este marco a una jerarquía de adopción, articulada mediante el modelo TOE (Tecnología-Organización-Entorno), que se retoma en la sección 2.4.</w:t>
+        <w:t>La información gestionada abarca datos no estructurados, indicaciones (prompts), código fuente, textos sintéticos y métricas de interacción. Los límites del sistema se extienden más allá de las fronteras organizacionales rígidas, integrando a los agentes de IA como cocreadores de valor y exigiendo mecanismos de control estricto sobre la entrada y la salida de datos (Wessel et al., 2025). La Figura 2.3 traduce este marco a una jerarquía de adopción, articulada mediante el modelo TOE (Tecnología-Organización-Entorno), que se retoma en la sección 2.4.</w:t>
       </w:r>
     </w:p>
     <w:p>
@@ -1168,29 +785,7 @@
           <w:sz w:val="22"/>
           <w:szCs w:val="22"/>
         </w:rPr>
-        <w:t xml:space="preserve">El caso faro delimita tres actores (propietarios de plataforma, </w:t>
-      </w:r>
-      <w:proofErr w:type="spellStart"/>
-      <w:r>
-        <w:rPr>
-          <w:rFonts w:ascii="Arial" w:eastAsia="Arial" w:hAnsi="Arial" w:cs="Arial"/>
-          <w:i/>
-          <w:iCs/>
-          <w:sz w:val="22"/>
-          <w:szCs w:val="22"/>
-        </w:rPr>
-        <w:t>complementadores</w:t>
-      </w:r>
-      <w:proofErr w:type="spellEnd"/>
-      <w:r>
-        <w:rPr>
-          <w:rFonts w:ascii="Arial" w:eastAsia="Arial" w:hAnsi="Arial" w:cs="Arial"/>
-          <w:i/>
-          <w:iCs/>
-          <w:sz w:val="22"/>
-          <w:szCs w:val="22"/>
-        </w:rPr>
-        <w:t xml:space="preserve"> y usuarios finales) cuya relación ya no está mediada solo por reglas organizacionales, sino por un sistema de límites abiertos donde la IA participa como cocreadora de valor y de riesgo al mismo tiempo (Figura 2.3).</w:t>
+        <w:t>El caso faro delimita tres actores (propietarios de plataforma, complementadores y usuarios finales) cuya relación ya no está mediada solo por reglas organizacionales, sino por un sistema de límites abiertos donde la IA participa como cocreadora de valor y de riesgo al mismo tiempo (Figura 2.3).</w:t>
       </w:r>
     </w:p>
     <w:p>
@@ -1463,25 +1058,7 @@
           <w:sz w:val="22"/>
           <w:szCs w:val="22"/>
         </w:rPr>
-        <w:t xml:space="preserve">Por su parte, la Figura 2.5 cruza los procesos de negocio clave —ventas y pedidos, gestión de inventarios— con las tecnologías integrantes (web, móvil, ERP/CRM e integración de IAGen), mostrando cómo cada proceso se apoya en experiencias de compra personalizadas, flujos de ventas automatizados, monitoreo inteligente de existencias y análisis predictivo para la optimización de la cadena de suministro (Haki &amp; Safaei, 2024; </w:t>
-      </w:r>
-      <w:proofErr w:type="spellStart"/>
-      <w:r>
-        <w:rPr>
-          <w:rFonts w:ascii="Arial" w:eastAsia="Arial" w:hAnsi="Arial" w:cs="Arial"/>
-          <w:sz w:val="22"/>
-          <w:szCs w:val="22"/>
-        </w:rPr>
-        <w:t>Jarzębowicz</w:t>
-      </w:r>
-      <w:proofErr w:type="spellEnd"/>
-      <w:r>
-        <w:rPr>
-          <w:rFonts w:ascii="Arial" w:eastAsia="Arial" w:hAnsi="Arial" w:cs="Arial"/>
-          <w:sz w:val="22"/>
-          <w:szCs w:val="22"/>
-        </w:rPr>
-        <w:t xml:space="preserve"> et al., 2025; Wessel et al., 2025).</w:t>
+        <w:t>Por su parte, la Figura 2.5 cruza los procesos de negocio clave —ventas y pedidos, gestión de inventarios— con las tecnologías integrantes (web, móvil, ERP/CRM e integración de IAGen), mostrando cómo cada proceso se apoya en experiencias de compra personalizadas, flujos de ventas automatizados, monitoreo inteligente de existencias y análisis predictivo para la optimización de la cadena de suministro (Haki &amp; Safaei, 2024; Jarzębowicz et al., 2025; Wessel et al., 2025).</w:t>
       </w:r>
     </w:p>
     <w:p>
@@ -1649,25 +1226,7 @@
           <w:szCs w:val="22"/>
         </w:rPr>
         <w:lastRenderedPageBreak/>
-        <w:t>servicios, su adopción masiva está limitada por desafíos críticos como la inestabilidad técnica (alucinaciones y deriva de rendimiento), la vulnerabilidad ética y la falta de marcos consolidados de gobernanza y privacidad (</w:t>
-      </w:r>
-      <w:proofErr w:type="spellStart"/>
-      <w:r>
-        <w:rPr>
-          <w:rFonts w:ascii="Arial" w:eastAsia="Arial" w:hAnsi="Arial" w:cs="Arial"/>
-          <w:sz w:val="22"/>
-          <w:szCs w:val="22"/>
-        </w:rPr>
-        <w:t>Jarzębowicz</w:t>
-      </w:r>
-      <w:proofErr w:type="spellEnd"/>
-      <w:r>
-        <w:rPr>
-          <w:rFonts w:ascii="Arial" w:eastAsia="Arial" w:hAnsi="Arial" w:cs="Arial"/>
-          <w:sz w:val="22"/>
-          <w:szCs w:val="22"/>
-        </w:rPr>
-        <w:t xml:space="preserve"> et al., 2025). La Figura 2.6 sintetiza el flujo metodológico completo del capítulo, desde la base operativa hasta la cúpula estratégica.</w:t>
+        <w:t>servicios, su adopción masiva está limitada por desafíos críticos como la inestabilidad técnica (alucinaciones y deriva de rendimiento), la vulnerabilidad ética y la falta de marcos consolidados de gobernanza y privacidad (Jarzębowicz et al., 2025). La Figura 2.6 sintetiza el flujo metodológico completo del capítulo, desde la base operativa hasta la cúpula estratégica.</w:t>
       </w:r>
     </w:p>
     <w:p>
@@ -1717,29 +1276,7 @@
           <w:szCs w:val="22"/>
           <w:highlight w:val="yellow"/>
         </w:rPr>
-        <w:t>¿Cómo pueden las organizaciones equilibrar la democratización del acceso a herramientas de IAGen para fomentar la innovación interna sin comprometer la seguridad de la información y la gobernanza de TI? (</w:t>
-      </w:r>
-      <w:proofErr w:type="spellStart"/>
-      <w:r>
-        <w:rPr>
-          <w:rFonts w:ascii="Arial" w:eastAsia="Arial" w:hAnsi="Arial" w:cs="Arial"/>
-          <w:color w:val="000000"/>
-          <w:sz w:val="22"/>
-          <w:szCs w:val="22"/>
-          <w:highlight w:val="yellow"/>
-        </w:rPr>
-        <w:t>Jarzębowicz</w:t>
-      </w:r>
-      <w:proofErr w:type="spellEnd"/>
-      <w:r>
-        <w:rPr>
-          <w:rFonts w:ascii="Arial" w:eastAsia="Arial" w:hAnsi="Arial" w:cs="Arial"/>
-          <w:color w:val="000000"/>
-          <w:sz w:val="22"/>
-          <w:szCs w:val="22"/>
-          <w:highlight w:val="yellow"/>
-        </w:rPr>
-        <w:t xml:space="preserve"> et al., 2025).</w:t>
+        <w:t>¿Cómo pueden las organizaciones equilibrar la democratización del acceso a herramientas de IAGen para fomentar la innovación interna sin comprometer la seguridad de la información y la gobernanza de TI? (Jarzębowicz et al., 2025).</w:t>
       </w:r>
     </w:p>
     <w:p>
@@ -1781,79 +1318,17 @@
           <w:szCs w:val="22"/>
           <w:highlight w:val="yellow"/>
         </w:rPr>
-        <w:t>human-in-</w:t>
-      </w:r>
-      <w:proofErr w:type="spellStart"/>
-      <w:r>
-        <w:rPr>
-          <w:rFonts w:ascii="Arial" w:eastAsia="Arial" w:hAnsi="Arial" w:cs="Arial"/>
-          <w:i/>
-          <w:iCs/>
+        <w:t>human-in-the-loop</w:t>
+      </w:r>
+      <w:r>
+        <w:rPr>
+          <w:rFonts w:ascii="Arial" w:eastAsia="Arial" w:hAnsi="Arial" w:cs="Arial"/>
           <w:color w:val="000000"/>
           <w:sz w:val="22"/>
           <w:szCs w:val="22"/>
           <w:highlight w:val="yellow"/>
         </w:rPr>
-        <w:t>the</w:t>
-      </w:r>
-      <w:proofErr w:type="spellEnd"/>
-      <w:r>
-        <w:rPr>
-          <w:rFonts w:ascii="Arial" w:eastAsia="Arial" w:hAnsi="Arial" w:cs="Arial"/>
-          <w:i/>
-          <w:iCs/>
-          <w:color w:val="000000"/>
-          <w:sz w:val="22"/>
-          <w:szCs w:val="22"/>
-          <w:highlight w:val="yellow"/>
-        </w:rPr>
-        <w:t>-</w:t>
-      </w:r>
-      <w:proofErr w:type="spellStart"/>
-      <w:r>
-        <w:rPr>
-          <w:rFonts w:ascii="Arial" w:eastAsia="Arial" w:hAnsi="Arial" w:cs="Arial"/>
-          <w:i/>
-          <w:iCs/>
-          <w:color w:val="000000"/>
-          <w:sz w:val="22"/>
-          <w:szCs w:val="22"/>
-          <w:highlight w:val="yellow"/>
-        </w:rPr>
-        <w:t>loop</w:t>
-      </w:r>
-      <w:proofErr w:type="spellEnd"/>
-      <w:r>
-        <w:rPr>
-          <w:rFonts w:ascii="Arial" w:eastAsia="Arial" w:hAnsi="Arial" w:cs="Arial"/>
-          <w:color w:val="000000"/>
-          <w:sz w:val="22"/>
-          <w:szCs w:val="22"/>
-          <w:highlight w:val="yellow"/>
-        </w:rPr>
-        <w:t>) en sistemas de decisión críticos? (</w:t>
-      </w:r>
-      <w:proofErr w:type="spellStart"/>
-      <w:r>
-        <w:rPr>
-          <w:rFonts w:ascii="Arial" w:eastAsia="Arial" w:hAnsi="Arial" w:cs="Arial"/>
-          <w:color w:val="000000"/>
-          <w:sz w:val="22"/>
-          <w:szCs w:val="22"/>
-          <w:highlight w:val="yellow"/>
-        </w:rPr>
-        <w:t>Jarzębowicz</w:t>
-      </w:r>
-      <w:proofErr w:type="spellEnd"/>
-      <w:r>
-        <w:rPr>
-          <w:rFonts w:ascii="Arial" w:eastAsia="Arial" w:hAnsi="Arial" w:cs="Arial"/>
-          <w:color w:val="000000"/>
-          <w:sz w:val="22"/>
-          <w:szCs w:val="22"/>
-          <w:highlight w:val="yellow"/>
-        </w:rPr>
-        <w:t xml:space="preserve"> et al., 2025).</w:t>
+        <w:t>) en sistemas de decisión críticos? (Jarzębowicz et al., 2025).</w:t>
       </w:r>
     </w:p>
     <w:p>
@@ -2038,7 +1513,152 @@
           <w:sz w:val="22"/>
           <w:szCs w:val="22"/>
         </w:rPr>
-        <w:t>Para esta actividad práctica usaremos la última versión de la Matriz Kanban del aplicativo “Los Huertos del JuanK”. Dentro de esto analizaremos los nivele de madurez tecnológica, el liderazgo directivo y las personas del entorno.</w:t>
+        <w:t>Para esta actividad práctica usaremos la última versión de la Matriz Kanban</w:t>
+      </w:r>
+      <w:r>
+        <w:rPr>
+          <w:rFonts w:ascii="Arial" w:eastAsia="Arial" w:hAnsi="Arial" w:cs="Arial"/>
+          <w:color w:val="000000"/>
+          <w:sz w:val="22"/>
+          <w:szCs w:val="22"/>
+        </w:rPr>
+        <w:t xml:space="preserve"> </w:t>
+      </w:r>
+      <w:r>
+        <w:rPr>
+          <w:rFonts w:ascii="Arial" w:eastAsia="Arial" w:hAnsi="Arial" w:cs="Arial"/>
+          <w:color w:val="000000"/>
+          <w:sz w:val="22"/>
+          <w:szCs w:val="22"/>
+        </w:rPr>
+        <w:t>del aplicativo “Los Huertos del JuanK”</w:t>
+      </w:r>
+      <w:r>
+        <w:rPr>
+          <w:rFonts w:ascii="Arial" w:eastAsia="Arial" w:hAnsi="Arial" w:cs="Arial"/>
+          <w:color w:val="000000"/>
+          <w:sz w:val="22"/>
+          <w:szCs w:val="22"/>
+        </w:rPr>
+        <w:t>, presente en el link adjunto:</w:t>
+      </w:r>
+    </w:p>
+    <w:p>
+      <w:pPr>
+        <w:pBdr>
+          <w:top w:val="nil"/>
+          <w:left w:val="nil"/>
+          <w:bottom w:val="nil"/>
+          <w:right w:val="nil"/>
+          <w:between w:val="nil"/>
+        </w:pBdr>
+        <w:spacing w:after="120"/>
+        <w:ind w:left="720"/>
+        <w:jc w:val="both"/>
+        <w:rPr>
+          <w:rFonts w:ascii="Arial" w:eastAsia="Arial" w:hAnsi="Arial" w:cs="Arial"/>
+          <w:color w:val="000000"/>
+          <w:sz w:val="22"/>
+          <w:szCs w:val="22"/>
+        </w:rPr>
+      </w:pPr>
+      <w:hyperlink r:id="rId12" w:history="1">
+        <w:r>
+          <w:rPr>
+            <w:rStyle w:val="Hipervnculo"/>
+            <w:rFonts w:ascii="Arial" w:eastAsia="Arial" w:hAnsi="Arial" w:cs="Arial"/>
+            <w:sz w:val="22"/>
+            <w:szCs w:val="22"/>
+          </w:rPr>
+          <w:t>https://github.com/ejayala/30693_MDS_G1/blob/9d0981b060f87d6c93aa997b067f71e62c81bb77/PREGAME/6.%20KANBAN/KANBAN_GR1_V5.0.xlsx</w:t>
+        </w:r>
+      </w:hyperlink>
+    </w:p>
+    <w:p>
+      <w:pPr>
+        <w:pBdr>
+          <w:top w:val="nil"/>
+          <w:left w:val="nil"/>
+          <w:bottom w:val="nil"/>
+          <w:right w:val="nil"/>
+          <w:between w:val="nil"/>
+        </w:pBdr>
+        <w:spacing w:after="120"/>
+        <w:ind w:left="720"/>
+        <w:jc w:val="both"/>
+        <w:rPr>
+          <w:rFonts w:ascii="Arial" w:eastAsia="Arial" w:hAnsi="Arial" w:cs="Arial"/>
+          <w:color w:val="000000"/>
+          <w:sz w:val="22"/>
+          <w:szCs w:val="22"/>
+        </w:rPr>
+      </w:pPr>
+      <w:r>
+        <w:rPr>
+          <w:rFonts w:ascii="Arial" w:eastAsia="Arial" w:hAnsi="Arial" w:cs="Arial"/>
+          <w:color w:val="000000"/>
+          <w:sz w:val="22"/>
+          <w:szCs w:val="22"/>
+        </w:rPr>
+        <w:t>Dentro de esto analizaremos los nivele de madurez tecnológica, el liderazgo directivo y las personas del entorno.</w:t>
+      </w:r>
+    </w:p>
+    <w:p>
+      <w:pPr>
+        <w:pBdr>
+          <w:top w:val="nil"/>
+          <w:left w:val="nil"/>
+          <w:bottom w:val="nil"/>
+          <w:right w:val="nil"/>
+          <w:between w:val="nil"/>
+        </w:pBdr>
+        <w:spacing w:after="120"/>
+        <w:ind w:left="720"/>
+        <w:jc w:val="both"/>
+        <w:rPr>
+          <w:rFonts w:ascii="Arial" w:eastAsia="Arial" w:hAnsi="Arial" w:cs="Arial"/>
+          <w:color w:val="000000"/>
+          <w:sz w:val="22"/>
+          <w:szCs w:val="22"/>
+        </w:rPr>
+      </w:pPr>
+      <w:r>
+        <w:rPr>
+          <w:rFonts w:ascii="Arial" w:eastAsia="Arial" w:hAnsi="Arial" w:cs="Arial"/>
+          <w:color w:val="000000"/>
+          <w:sz w:val="22"/>
+          <w:szCs w:val="22"/>
+        </w:rPr>
+        <w:t>Tabla 2.1</w:t>
+      </w:r>
+    </w:p>
+    <w:p>
+      <w:pPr>
+        <w:pBdr>
+          <w:top w:val="nil"/>
+          <w:left w:val="nil"/>
+          <w:bottom w:val="nil"/>
+          <w:right w:val="nil"/>
+          <w:between w:val="nil"/>
+        </w:pBdr>
+        <w:spacing w:after="120"/>
+        <w:ind w:left="720"/>
+        <w:jc w:val="both"/>
+        <w:rPr>
+          <w:rFonts w:ascii="Arial" w:eastAsia="Arial" w:hAnsi="Arial" w:cs="Arial"/>
+          <w:color w:val="000000"/>
+          <w:sz w:val="22"/>
+          <w:szCs w:val="22"/>
+        </w:rPr>
+      </w:pPr>
+      <w:r>
+        <w:rPr>
+          <w:rFonts w:ascii="Arial" w:eastAsia="Arial" w:hAnsi="Arial" w:cs="Arial"/>
+          <w:color w:val="000000"/>
+          <w:sz w:val="22"/>
+          <w:szCs w:val="22"/>
+        </w:rPr>
+        <w:t>Evaluación de dimensiones TOE de matriz KANBAN</w:t>
       </w:r>
     </w:p>
     <w:tbl>
@@ -2220,23 +1840,14 @@
                 <w:rFonts w:ascii="Arial" w:eastAsia="Arial" w:hAnsi="Arial" w:cs="Arial"/>
               </w:rPr>
             </w:pPr>
-            <w:proofErr w:type="spellStart"/>
             <w:r>
               <w:rPr>
                 <w:rFonts w:ascii="Arial" w:eastAsia="Arial" w:hAnsi="Arial" w:cs="Arial"/>
                 <w:b/>
                 <w:bCs/>
               </w:rPr>
-              <w:t>Testing</w:t>
-            </w:r>
-            <w:proofErr w:type="spellEnd"/>
-            <w:r>
-              <w:rPr>
-                <w:rFonts w:ascii="Arial" w:eastAsia="Arial" w:hAnsi="Arial" w:cs="Arial"/>
-                <w:b/>
-                <w:bCs/>
-              </w:rPr>
-              <w:t xml:space="preserve"> (Caja blanca y negra):</w:t>
+              <w:lastRenderedPageBreak/>
+              <w:t>Testing (Caja blanca y negra):</w:t>
             </w:r>
             <w:r>
               <w:rPr>
@@ -2263,7 +1874,15 @@
               <w:rPr>
                 <w:rFonts w:ascii="Arial" w:eastAsia="Arial" w:hAnsi="Arial" w:cs="Arial"/>
               </w:rPr>
-              <w:t>Evalúa la infraestructura y competencias para integrar IAGen en el diseño de código y casos de prueba (caja negra y blanca). El desafío técnico radica en prevenir alucinaciones o errores de lógica en las reglas del sistema mediante revisión rigurosa.</w:t>
+              <w:lastRenderedPageBreak/>
+              <w:t xml:space="preserve">Evalúa la infraestructura y competencias para integrar IAGen en el diseño de código y casos de prueba (caja negra y blanca). El desafío técnico radica en prevenir alucinaciones o errores de lógica en </w:t>
+            </w:r>
+            <w:r>
+              <w:rPr>
+                <w:rFonts w:ascii="Arial" w:eastAsia="Arial" w:hAnsi="Arial" w:cs="Arial"/>
+              </w:rPr>
+              <w:lastRenderedPageBreak/>
+              <w:t>las reglas del sistema mediante revisión rigurosa.</w:t>
             </w:r>
           </w:p>
         </w:tc>
@@ -2288,6 +1907,7 @@
               <w:rPr>
                 <w:rFonts w:ascii="Arial" w:eastAsia="Arial" w:hAnsi="Arial" w:cs="Arial"/>
               </w:rPr>
+              <w:lastRenderedPageBreak/>
               <w:t>Organizacional</w:t>
             </w:r>
           </w:p>
@@ -2379,7 +1999,6 @@
                 <w:b/>
                 <w:bCs/>
               </w:rPr>
-              <w:lastRenderedPageBreak/>
               <w:t>Hitos de Entrega:</w:t>
             </w:r>
             <w:r>
@@ -2407,7 +2026,6 @@
               <w:rPr>
                 <w:rFonts w:ascii="Arial" w:eastAsia="Arial" w:hAnsi="Arial" w:cs="Arial"/>
               </w:rPr>
-              <w:lastRenderedPageBreak/>
               <w:t>Examina la planificación ágil y las políticas de supervisión del equipo directivo. Establece controles para regular el uso de IA</w:t>
             </w:r>
             <w:r>
@@ -2422,7 +2040,7 @@
                 <w:i/>
                 <w:iCs/>
               </w:rPr>
-              <w:t xml:space="preserve">evitar Shadow </w:t>
+              <w:t>evitar Shadow A</w:t>
             </w:r>
             <w:r>
               <w:rPr>
@@ -2430,8 +2048,13 @@
                 <w:i/>
                 <w:iCs/>
               </w:rPr>
-              <w:lastRenderedPageBreak/>
-              <w:t>A</w:t>
+              <w:t>I,</w:t>
+            </w:r>
+            <w:r>
+              <w:rPr>
+                <w:rFonts w:ascii="Arial" w:eastAsia="Arial" w:hAnsi="Arial" w:cs="Arial"/>
+              </w:rPr>
+              <w:t xml:space="preserve"> e institucionaliza el criterio humano (</w:t>
             </w:r>
             <w:r>
               <w:rPr>
@@ -2439,39 +2062,7 @@
                 <w:i/>
                 <w:iCs/>
               </w:rPr>
-              <w:t>I,</w:t>
-            </w:r>
-            <w:r>
-              <w:rPr>
-                <w:rFonts w:ascii="Arial" w:eastAsia="Arial" w:hAnsi="Arial" w:cs="Arial"/>
-              </w:rPr>
-              <w:t xml:space="preserve"> e institucionaliza el criterio humano (</w:t>
-            </w:r>
-            <w:r>
-              <w:rPr>
-                <w:rFonts w:ascii="Arial" w:eastAsia="Arial" w:hAnsi="Arial" w:cs="Arial"/>
-                <w:i/>
-                <w:iCs/>
-              </w:rPr>
-              <w:t>Human-in-</w:t>
-            </w:r>
-            <w:proofErr w:type="spellStart"/>
-            <w:r>
-              <w:rPr>
-                <w:rFonts w:ascii="Arial" w:eastAsia="Arial" w:hAnsi="Arial" w:cs="Arial"/>
-                <w:i/>
-                <w:iCs/>
-              </w:rPr>
-              <w:t>the</w:t>
-            </w:r>
-            <w:proofErr w:type="spellEnd"/>
-            <w:r>
-              <w:rPr>
-                <w:rFonts w:ascii="Arial" w:eastAsia="Arial" w:hAnsi="Arial" w:cs="Arial"/>
-                <w:i/>
-                <w:iCs/>
-              </w:rPr>
-              <w:t>-Loop</w:t>
+              <w:t>Human-in-the-Loop</w:t>
             </w:r>
             <w:r>
               <w:rPr>
@@ -2505,7 +2096,6 @@
               <w:rPr>
                 <w:rFonts w:ascii="Arial" w:eastAsia="Arial" w:hAnsi="Arial" w:cs="Arial"/>
               </w:rPr>
-              <w:lastRenderedPageBreak/>
               <w:t>Entorno</w:t>
             </w:r>
           </w:p>
@@ -2694,27 +2284,7 @@
           <w:sz w:val="22"/>
           <w:szCs w:val="22"/>
         </w:rPr>
-        <w:t xml:space="preserve">mapear los flujos de información del sistema actual e identificar en qué puntos de control la IAGen actuará como cocreadora o </w:t>
-      </w:r>
-      <w:proofErr w:type="spellStart"/>
-      <w:r>
-        <w:rPr>
-          <w:rFonts w:ascii="Arial" w:eastAsia="Arial" w:hAnsi="Arial" w:cs="Arial"/>
-          <w:color w:val="000000"/>
-          <w:sz w:val="22"/>
-          <w:szCs w:val="22"/>
-        </w:rPr>
-        <w:t>automatizadora</w:t>
-      </w:r>
-      <w:proofErr w:type="spellEnd"/>
-      <w:r>
-        <w:rPr>
-          <w:rFonts w:ascii="Arial" w:eastAsia="Arial" w:hAnsi="Arial" w:cs="Arial"/>
-          <w:color w:val="000000"/>
-          <w:sz w:val="22"/>
-          <w:szCs w:val="22"/>
-        </w:rPr>
-        <w:t xml:space="preserve"> de tareas (Wessel et al., 2025).</w:t>
+        <w:t>mapear los flujos de información del sistema actual e identificar en qué puntos de control la IAGen actuará como cocreadora o automatizadora de tareas (Wessel et al., 2025).</w:t>
       </w:r>
     </w:p>
     <w:p>
@@ -2881,27 +2451,7 @@
           <w:sz w:val="22"/>
           <w:szCs w:val="22"/>
         </w:rPr>
-        <w:t>Control (Human-in-</w:t>
-      </w:r>
-      <w:proofErr w:type="spellStart"/>
-      <w:r>
-        <w:rPr>
-          <w:rFonts w:ascii="Arial" w:eastAsia="Arial" w:hAnsi="Arial" w:cs="Arial"/>
-          <w:color w:val="000000"/>
-          <w:sz w:val="22"/>
-          <w:szCs w:val="22"/>
-        </w:rPr>
-        <w:t>the</w:t>
-      </w:r>
-      <w:proofErr w:type="spellEnd"/>
-      <w:r>
-        <w:rPr>
-          <w:rFonts w:ascii="Arial" w:eastAsia="Arial" w:hAnsi="Arial" w:cs="Arial"/>
-          <w:color w:val="000000"/>
-          <w:sz w:val="22"/>
-          <w:szCs w:val="22"/>
-        </w:rPr>
-        <w:t>-Loop): El analista valida que no se agreguen módulos excluidos (sin, login, sin conexión web, sin facturación SRI).</w:t>
+        <w:t>Control (Human-in-the-Loop): El analista valida que no se agreguen módulos excluidos (sin, login, sin conexión web, sin facturación SRI).</w:t>
       </w:r>
     </w:p>
     <w:p>
@@ -3094,7 +2644,6 @@
         </w:rPr>
         <w:t xml:space="preserve">Rol IAGen: </w:t>
       </w:r>
-      <w:proofErr w:type="spellStart"/>
       <w:r>
         <w:rPr>
           <w:rFonts w:ascii="Arial" w:eastAsia="Arial" w:hAnsi="Arial" w:cs="Arial"/>
@@ -3104,7 +2653,6 @@
         </w:rPr>
         <w:t>Automatizadora</w:t>
       </w:r>
-      <w:proofErr w:type="spellEnd"/>
       <w:r>
         <w:rPr>
           <w:rFonts w:ascii="Arial" w:eastAsia="Arial" w:hAnsi="Arial" w:cs="Arial"/>
@@ -3160,27 +2708,7 @@
           <w:sz w:val="22"/>
           <w:szCs w:val="22"/>
         </w:rPr>
-        <w:t>Control (Human-in-</w:t>
-      </w:r>
-      <w:proofErr w:type="spellStart"/>
-      <w:r>
-        <w:rPr>
-          <w:rFonts w:ascii="Arial" w:eastAsia="Arial" w:hAnsi="Arial" w:cs="Arial"/>
-          <w:color w:val="000000"/>
-          <w:sz w:val="22"/>
-          <w:szCs w:val="22"/>
-        </w:rPr>
-        <w:t>the</w:t>
-      </w:r>
-      <w:proofErr w:type="spellEnd"/>
-      <w:r>
-        <w:rPr>
-          <w:rFonts w:ascii="Arial" w:eastAsia="Arial" w:hAnsi="Arial" w:cs="Arial"/>
-          <w:color w:val="000000"/>
-          <w:sz w:val="22"/>
-          <w:szCs w:val="22"/>
-        </w:rPr>
-        <w:t xml:space="preserve">-Loop): </w:t>
+        <w:t xml:space="preserve">Control (Human-in-the-Loop): </w:t>
       </w:r>
       <w:r>
         <w:rPr>
@@ -3437,27 +2965,8 @@
           <w:sz w:val="22"/>
           <w:szCs w:val="22"/>
         </w:rPr>
-        <w:t>Control (Human-in-</w:t>
-      </w:r>
-      <w:proofErr w:type="spellStart"/>
-      <w:r>
-        <w:rPr>
-          <w:rFonts w:ascii="Arial" w:eastAsia="Arial" w:hAnsi="Arial" w:cs="Arial"/>
-          <w:color w:val="000000"/>
-          <w:sz w:val="22"/>
-          <w:szCs w:val="22"/>
-        </w:rPr>
-        <w:t>the</w:t>
-      </w:r>
-      <w:proofErr w:type="spellEnd"/>
-      <w:r>
-        <w:rPr>
-          <w:rFonts w:ascii="Arial" w:eastAsia="Arial" w:hAnsi="Arial" w:cs="Arial"/>
-          <w:color w:val="000000"/>
-          <w:sz w:val="22"/>
-          <w:szCs w:val="22"/>
-        </w:rPr>
-        <w:t xml:space="preserve">-Loop): </w:t>
+        <w:lastRenderedPageBreak/>
+        <w:t xml:space="preserve">Control (Human-in-the-Loop): </w:t>
       </w:r>
       <w:r>
         <w:rPr>
@@ -3668,25 +3177,14 @@
         </w:rPr>
         <w:t xml:space="preserve">Rol IAGen: </w:t>
       </w:r>
-      <w:proofErr w:type="spellStart"/>
-      <w:r>
-        <w:rPr>
-          <w:rFonts w:ascii="Arial" w:eastAsia="Arial" w:hAnsi="Arial" w:cs="Arial"/>
-          <w:color w:val="000000"/>
-          <w:sz w:val="22"/>
-          <w:szCs w:val="22"/>
-        </w:rPr>
-        <w:t>Automatizadora</w:t>
-      </w:r>
-      <w:proofErr w:type="spellEnd"/>
-      <w:r>
-        <w:rPr>
-          <w:rFonts w:ascii="Arial" w:eastAsia="Arial" w:hAnsi="Arial" w:cs="Arial"/>
-          <w:color w:val="000000"/>
-          <w:sz w:val="22"/>
-          <w:szCs w:val="22"/>
-        </w:rPr>
-        <w:t>, genera resúmenes ejecutivos y tablas dinámicas de los productos más vendidos</w:t>
+      <w:r>
+        <w:rPr>
+          <w:rFonts w:ascii="Arial" w:eastAsia="Arial" w:hAnsi="Arial" w:cs="Arial"/>
+          <w:color w:val="000000"/>
+          <w:sz w:val="22"/>
+          <w:szCs w:val="22"/>
+        </w:rPr>
+        <w:t>Automatizadora, genera resúmenes ejecutivos y tablas dinámicas de los productos más vendidos</w:t>
       </w:r>
       <w:r>
         <w:rPr>
@@ -3725,28 +3223,7 @@
           <w:sz w:val="22"/>
           <w:szCs w:val="22"/>
         </w:rPr>
-        <w:lastRenderedPageBreak/>
-        <w:t>Control (Human-in-</w:t>
-      </w:r>
-      <w:proofErr w:type="spellStart"/>
-      <w:r>
-        <w:rPr>
-          <w:rFonts w:ascii="Arial" w:eastAsia="Arial" w:hAnsi="Arial" w:cs="Arial"/>
-          <w:color w:val="000000"/>
-          <w:sz w:val="22"/>
-          <w:szCs w:val="22"/>
-        </w:rPr>
-        <w:t>the</w:t>
-      </w:r>
-      <w:proofErr w:type="spellEnd"/>
-      <w:r>
-        <w:rPr>
-          <w:rFonts w:ascii="Arial" w:eastAsia="Arial" w:hAnsi="Arial" w:cs="Arial"/>
-          <w:color w:val="000000"/>
-          <w:sz w:val="22"/>
-          <w:szCs w:val="22"/>
-        </w:rPr>
-        <w:t xml:space="preserve">-Loop): </w:t>
+        <w:t xml:space="preserve">Control (Human-in-the-Loop): </w:t>
       </w:r>
       <w:r>
         <w:rPr>
@@ -3843,27 +3320,154 @@
           <w:sz w:val="22"/>
           <w:szCs w:val="22"/>
         </w:rPr>
-        <w:t>analizar las brechas sociotécnicas del proceso e instituir mecanismos de supervisión para mitigar riesgos de privacidad, sesgos e inestabilidad del sistema (</w:t>
-      </w:r>
-      <w:proofErr w:type="spellStart"/>
-      <w:r>
-        <w:rPr>
-          <w:rFonts w:ascii="Arial" w:eastAsia="Arial" w:hAnsi="Arial" w:cs="Arial"/>
-          <w:color w:val="000000"/>
-          <w:sz w:val="22"/>
-          <w:szCs w:val="22"/>
-        </w:rPr>
-        <w:t>Jarzębowicz</w:t>
-      </w:r>
-      <w:proofErr w:type="spellEnd"/>
-      <w:r>
-        <w:rPr>
-          <w:rFonts w:ascii="Arial" w:eastAsia="Arial" w:hAnsi="Arial" w:cs="Arial"/>
-          <w:color w:val="000000"/>
-          <w:sz w:val="22"/>
-          <w:szCs w:val="22"/>
-        </w:rPr>
-        <w:t xml:space="preserve"> et al., 2025).</w:t>
+        <w:t>analizar las brechas sociotécnicas del proceso e instituir mecanismos de supervisión para mitigar riesgos de privacidad, sesgos e inestabilidad del sistema (Jarzębowicz et al., 2025).</w:t>
+      </w:r>
+    </w:p>
+    <w:p>
+      <w:pPr>
+        <w:pBdr>
+          <w:top w:val="nil"/>
+          <w:left w:val="nil"/>
+          <w:bottom w:val="nil"/>
+          <w:right w:val="nil"/>
+          <w:between w:val="nil"/>
+        </w:pBdr>
+        <w:spacing w:after="120"/>
+        <w:ind w:left="720"/>
+        <w:jc w:val="both"/>
+        <w:rPr>
+          <w:rFonts w:ascii="Arial" w:eastAsia="Arial" w:hAnsi="Arial" w:cs="Arial"/>
+          <w:color w:val="000000"/>
+          <w:sz w:val="22"/>
+          <w:szCs w:val="22"/>
+        </w:rPr>
+      </w:pPr>
+      <w:r>
+        <w:rPr>
+          <w:rFonts w:ascii="Arial" w:eastAsia="Arial" w:hAnsi="Arial" w:cs="Arial"/>
+          <w:color w:val="000000"/>
+          <w:sz w:val="22"/>
+          <w:szCs w:val="22"/>
+        </w:rPr>
+        <w:t>Para este paso usaremos el perfil del proyecto “Los Hueros del JuanK”, presente en el link adjunto:</w:t>
+      </w:r>
+    </w:p>
+    <w:p>
+      <w:pPr>
+        <w:pBdr>
+          <w:top w:val="nil"/>
+          <w:left w:val="nil"/>
+          <w:bottom w:val="nil"/>
+          <w:right w:val="nil"/>
+          <w:between w:val="nil"/>
+        </w:pBdr>
+        <w:spacing w:after="120"/>
+        <w:ind w:left="720"/>
+        <w:jc w:val="both"/>
+        <w:rPr>
+          <w:rFonts w:ascii="Arial" w:eastAsia="Arial" w:hAnsi="Arial" w:cs="Arial"/>
+          <w:color w:val="000000"/>
+          <w:sz w:val="22"/>
+          <w:szCs w:val="22"/>
+        </w:rPr>
+      </w:pPr>
+      <w:hyperlink r:id="rId13" w:history="1">
+        <w:r>
+          <w:rPr>
+            <w:rStyle w:val="Hipervnculo"/>
+            <w:rFonts w:ascii="Arial" w:eastAsia="Arial" w:hAnsi="Arial" w:cs="Arial"/>
+            <w:sz w:val="22"/>
+            <w:szCs w:val="22"/>
+          </w:rPr>
+          <w:t>https://github.com/ejayala/30693_MDS_G1/blob/9d0981b060f87d6c93aa997b067f71e62c81bb77/PREGAME/5.%20PERFIL%20PROYECTO%20INTEGRADOR/Perfil-Proyecto_V7__GR1.pdf</w:t>
+        </w:r>
+      </w:hyperlink>
+    </w:p>
+    <w:p>
+      <w:pPr>
+        <w:pBdr>
+          <w:top w:val="nil"/>
+          <w:left w:val="nil"/>
+          <w:bottom w:val="nil"/>
+          <w:right w:val="nil"/>
+          <w:between w:val="nil"/>
+        </w:pBdr>
+        <w:spacing w:after="120"/>
+        <w:ind w:left="720"/>
+        <w:jc w:val="both"/>
+        <w:rPr>
+          <w:rFonts w:ascii="Arial" w:eastAsia="Arial" w:hAnsi="Arial" w:cs="Arial"/>
+          <w:color w:val="000000"/>
+          <w:sz w:val="22"/>
+          <w:szCs w:val="22"/>
+        </w:rPr>
+      </w:pPr>
+      <w:r>
+        <w:rPr>
+          <w:rFonts w:ascii="Arial" w:eastAsia="Arial" w:hAnsi="Arial" w:cs="Arial"/>
+          <w:color w:val="000000"/>
+          <w:sz w:val="22"/>
+          <w:szCs w:val="22"/>
+        </w:rPr>
+        <w:t>Dentro de este mismo analizaremos las brechas sociotécnicas existentes dentro del proyecto presentado.</w:t>
+      </w:r>
+    </w:p>
+    <w:p>
+      <w:pPr>
+        <w:pBdr>
+          <w:top w:val="nil"/>
+          <w:left w:val="nil"/>
+          <w:bottom w:val="nil"/>
+          <w:right w:val="nil"/>
+          <w:between w:val="nil"/>
+        </w:pBdr>
+        <w:spacing w:after="120"/>
+        <w:ind w:left="720"/>
+        <w:jc w:val="both"/>
+        <w:rPr>
+          <w:rFonts w:ascii="Arial" w:eastAsia="Arial" w:hAnsi="Arial" w:cs="Arial"/>
+          <w:color w:val="000000"/>
+          <w:sz w:val="22"/>
+          <w:szCs w:val="22"/>
+        </w:rPr>
+      </w:pPr>
+      <w:r>
+        <w:rPr>
+          <w:rFonts w:ascii="Arial" w:eastAsia="Arial" w:hAnsi="Arial" w:cs="Arial"/>
+          <w:color w:val="000000"/>
+          <w:sz w:val="22"/>
+          <w:szCs w:val="22"/>
+        </w:rPr>
+        <w:t>Tabla 2.2</w:t>
+      </w:r>
+    </w:p>
+    <w:p>
+      <w:pPr>
+        <w:pBdr>
+          <w:top w:val="nil"/>
+          <w:left w:val="nil"/>
+          <w:bottom w:val="nil"/>
+          <w:right w:val="nil"/>
+          <w:between w:val="nil"/>
+        </w:pBdr>
+        <w:spacing w:after="120"/>
+        <w:ind w:left="720"/>
+        <w:jc w:val="both"/>
+        <w:rPr>
+          <w:rFonts w:ascii="Arial" w:eastAsia="Arial" w:hAnsi="Arial" w:cs="Arial"/>
+          <w:color w:val="000000"/>
+          <w:sz w:val="22"/>
+          <w:szCs w:val="22"/>
+        </w:rPr>
+      </w:pPr>
+      <w:r>
+        <w:rPr>
+          <w:rFonts w:ascii="Arial" w:eastAsia="Arial" w:hAnsi="Arial" w:cs="Arial"/>
+          <w:color w:val="000000"/>
+          <w:sz w:val="22"/>
+          <w:szCs w:val="22"/>
+        </w:rPr>
+        <w:t xml:space="preserve">Análisis de brechas sociotécnicas </w:t>
       </w:r>
     </w:p>
     <w:tbl>
@@ -4032,21 +3636,7 @@
               <w:rPr>
                 <w:rFonts w:ascii="Arial" w:eastAsia="Arial" w:hAnsi="Arial" w:cs="Arial"/>
               </w:rPr>
-              <w:t xml:space="preserve"> Prohibir el envío de identificadores personales en </w:t>
-            </w:r>
-            <w:proofErr w:type="spellStart"/>
-            <w:r>
-              <w:rPr>
-                <w:rFonts w:ascii="Arial" w:eastAsia="Arial" w:hAnsi="Arial" w:cs="Arial"/>
-              </w:rPr>
-              <w:t>prompts</w:t>
-            </w:r>
-            <w:proofErr w:type="spellEnd"/>
-            <w:r>
-              <w:rPr>
-                <w:rFonts w:ascii="Arial" w:eastAsia="Arial" w:hAnsi="Arial" w:cs="Arial"/>
-              </w:rPr>
-              <w:t>; usar datos sintéticos durante pruebas y restringir consultas de IA al entorno local sin conexión persistente.</w:t>
+              <w:t xml:space="preserve"> Prohibir el envío de identificadores personales en prompts; usar datos sintéticos durante pruebas y restringir consultas de IA al entorno local sin conexión persistente.</w:t>
             </w:r>
           </w:p>
         </w:tc>
@@ -4157,6 +3747,7 @@
               <w:rPr>
                 <w:rFonts w:ascii="Arial" w:eastAsia="Arial" w:hAnsi="Arial" w:cs="Arial"/>
               </w:rPr>
+              <w:lastRenderedPageBreak/>
               <w:t>Inestabilidad y Deriva del Modelo</w:t>
             </w:r>
           </w:p>
@@ -4186,21 +3777,7 @@
               <w:rPr>
                 <w:rFonts w:ascii="Arial" w:eastAsia="Arial" w:hAnsi="Arial" w:cs="Arial"/>
               </w:rPr>
-              <w:t xml:space="preserve">Generación de respuestas variables o no estructuradas que rompan el formato esperado por librerías como Apache POI o generen código Java no </w:t>
-            </w:r>
-            <w:proofErr w:type="spellStart"/>
-            <w:r>
-              <w:rPr>
-                <w:rFonts w:ascii="Arial" w:eastAsia="Arial" w:hAnsi="Arial" w:cs="Arial"/>
-              </w:rPr>
-              <w:t>compilable</w:t>
-            </w:r>
-            <w:proofErr w:type="spellEnd"/>
-            <w:r>
-              <w:rPr>
-                <w:rFonts w:ascii="Arial" w:eastAsia="Arial" w:hAnsi="Arial" w:cs="Arial"/>
-              </w:rPr>
-              <w:t>.</w:t>
+              <w:t>Generación de respuestas variables o no estructuradas que rompan el formato esperado por librerías como Apache POI o generen código Java no compilable.</w:t>
             </w:r>
           </w:p>
         </w:tc>
@@ -4223,77 +3800,13 @@
                 <w:b/>
                 <w:bCs/>
               </w:rPr>
-              <w:t xml:space="preserve">Ingeniería de </w:t>
-            </w:r>
-            <w:proofErr w:type="spellStart"/>
-            <w:r>
-              <w:rPr>
-                <w:rFonts w:ascii="Arial" w:eastAsia="Arial" w:hAnsi="Arial" w:cs="Arial"/>
-                <w:b/>
-                <w:bCs/>
-              </w:rPr>
-              <w:t>Prompts</w:t>
-            </w:r>
-            <w:proofErr w:type="spellEnd"/>
-            <w:r>
-              <w:rPr>
-                <w:rFonts w:ascii="Arial" w:eastAsia="Arial" w:hAnsi="Arial" w:cs="Arial"/>
-                <w:b/>
-                <w:bCs/>
-              </w:rPr>
-              <w:t xml:space="preserve"> con Salidas </w:t>
-            </w:r>
-            <w:proofErr w:type="spellStart"/>
-            <w:r>
-              <w:rPr>
-                <w:rFonts w:ascii="Arial" w:eastAsia="Arial" w:hAnsi="Arial" w:cs="Arial"/>
-                <w:b/>
-                <w:bCs/>
-              </w:rPr>
-              <w:t>Tipadas</w:t>
-            </w:r>
-            <w:proofErr w:type="spellEnd"/>
-            <w:r>
-              <w:rPr>
-                <w:rFonts w:ascii="Arial" w:eastAsia="Arial" w:hAnsi="Arial" w:cs="Arial"/>
-                <w:b/>
-                <w:bCs/>
-              </w:rPr>
-              <w:t>:</w:t>
-            </w:r>
-            <w:r>
-              <w:rPr>
-                <w:rFonts w:ascii="Arial" w:eastAsia="Arial" w:hAnsi="Arial" w:cs="Arial"/>
-              </w:rPr>
-              <w:t xml:space="preserve"> Uso de </w:t>
-            </w:r>
-            <w:proofErr w:type="spellStart"/>
-            <w:r>
-              <w:rPr>
-                <w:rFonts w:ascii="Arial" w:eastAsia="Arial" w:hAnsi="Arial" w:cs="Arial"/>
-              </w:rPr>
-              <w:t>few-shot</w:t>
-            </w:r>
-            <w:proofErr w:type="spellEnd"/>
-            <w:r>
-              <w:rPr>
-                <w:rFonts w:ascii="Arial" w:eastAsia="Arial" w:hAnsi="Arial" w:cs="Arial"/>
-              </w:rPr>
-              <w:t xml:space="preserve"> </w:t>
-            </w:r>
-            <w:proofErr w:type="spellStart"/>
-            <w:r>
-              <w:rPr>
-                <w:rFonts w:ascii="Arial" w:eastAsia="Arial" w:hAnsi="Arial" w:cs="Arial"/>
-              </w:rPr>
-              <w:t>prompts</w:t>
-            </w:r>
-            <w:proofErr w:type="spellEnd"/>
-            <w:r>
-              <w:rPr>
-                <w:rFonts w:ascii="Arial" w:eastAsia="Arial" w:hAnsi="Arial" w:cs="Arial"/>
-              </w:rPr>
-              <w:t xml:space="preserve"> exigiendo formatos estrictos (JSON/CSV) y revisión técnica obligatoria por el desarrollador antes de integrar código o datos al repositorio.</w:t>
+              <w:t>Ingeniería de Prompts con Salidas Tipadas:</w:t>
+            </w:r>
+            <w:r>
+              <w:rPr>
+                <w:rFonts w:ascii="Arial" w:eastAsia="Arial" w:hAnsi="Arial" w:cs="Arial"/>
+              </w:rPr>
+              <w:t xml:space="preserve"> Uso de few-shot prompts exigiendo formatos estrictos (JSON/CSV) y revisión técnica obligatoria por el desarrollador antes de integrar código o datos al repositorio.</w:t>
             </w:r>
           </w:p>
         </w:tc>
@@ -4363,73 +3876,13 @@
                 <w:b/>
                 <w:bCs/>
               </w:rPr>
-              <w:t xml:space="preserve">Gobernanza de Equipo y Bitácora de </w:t>
-            </w:r>
-            <w:proofErr w:type="spellStart"/>
-            <w:r>
-              <w:rPr>
-                <w:rFonts w:ascii="Arial" w:eastAsia="Arial" w:hAnsi="Arial" w:cs="Arial"/>
-                <w:b/>
-                <w:bCs/>
-              </w:rPr>
-              <w:t>Prompts</w:t>
-            </w:r>
-            <w:proofErr w:type="spellEnd"/>
-            <w:r>
-              <w:rPr>
-                <w:rFonts w:ascii="Arial" w:eastAsia="Arial" w:hAnsi="Arial" w:cs="Arial"/>
-                <w:b/>
-                <w:bCs/>
-              </w:rPr>
-              <w:t>:</w:t>
-            </w:r>
-            <w:r>
-              <w:rPr>
-                <w:rFonts w:ascii="Arial" w:eastAsia="Arial" w:hAnsi="Arial" w:cs="Arial"/>
-              </w:rPr>
-              <w:t xml:space="preserve"> Registro obligatorio de </w:t>
-            </w:r>
-            <w:proofErr w:type="spellStart"/>
-            <w:r>
-              <w:rPr>
-                <w:rFonts w:ascii="Arial" w:eastAsia="Arial" w:hAnsi="Arial" w:cs="Arial"/>
-              </w:rPr>
-              <w:t>prompts</w:t>
-            </w:r>
-            <w:proofErr w:type="spellEnd"/>
-            <w:r>
-              <w:rPr>
-                <w:rFonts w:ascii="Arial" w:eastAsia="Arial" w:hAnsi="Arial" w:cs="Arial"/>
-              </w:rPr>
-              <w:t xml:space="preserve"> utilizados en las tarjetas de Jira/Kanban y revisión cruzada por pares (</w:t>
-            </w:r>
-            <w:proofErr w:type="spellStart"/>
-            <w:r>
-              <w:rPr>
-                <w:rFonts w:ascii="Arial" w:eastAsia="Arial" w:hAnsi="Arial" w:cs="Arial"/>
-              </w:rPr>
-              <w:t>code</w:t>
-            </w:r>
-            <w:proofErr w:type="spellEnd"/>
-            <w:r>
-              <w:rPr>
-                <w:rFonts w:ascii="Arial" w:eastAsia="Arial" w:hAnsi="Arial" w:cs="Arial"/>
-              </w:rPr>
-              <w:t xml:space="preserve"> </w:t>
-            </w:r>
-            <w:proofErr w:type="spellStart"/>
-            <w:r>
-              <w:rPr>
-                <w:rFonts w:ascii="Arial" w:eastAsia="Arial" w:hAnsi="Arial" w:cs="Arial"/>
-              </w:rPr>
-              <w:t>review</w:t>
-            </w:r>
-            <w:proofErr w:type="spellEnd"/>
-            <w:r>
-              <w:rPr>
-                <w:rFonts w:ascii="Arial" w:eastAsia="Arial" w:hAnsi="Arial" w:cs="Arial"/>
-              </w:rPr>
-              <w:t>) en cada cierre de Sprint.</w:t>
+              <w:t>Gobernanza de Equipo y Bitácora de Prompts:</w:t>
+            </w:r>
+            <w:r>
+              <w:rPr>
+                <w:rFonts w:ascii="Arial" w:eastAsia="Arial" w:hAnsi="Arial" w:cs="Arial"/>
+              </w:rPr>
+              <w:t xml:space="preserve"> Registro obligatorio de prompts utilizados en las tarjetas de Jira/Kanban y revisión cruzada por pares (code review) en cada cierre de Sprint.</w:t>
             </w:r>
           </w:p>
         </w:tc>
@@ -4488,7 +3941,6 @@
         <w:rPr>
           <w:noProof/>
         </w:rPr>
-        <w:lastRenderedPageBreak/>
         <w:drawing>
           <wp:inline distT="114300" distB="114300" distL="114300" distR="114300" wp14:anchorId="30A38F1B" wp14:editId="0DB5C924">
             <wp:extent cx="5943600" cy="4064000"/>
@@ -4503,7 +3955,7 @@
                     <pic:cNvPicPr preferRelativeResize="0"/>
                   </pic:nvPicPr>
                   <pic:blipFill>
-                    <a:blip r:embed="rId12"/>
+                    <a:blip r:embed="rId14"/>
                     <a:srcRect/>
                     <a:stretch>
                       <a:fillRect/>
@@ -4566,6 +4018,7 @@
           <w:sz w:val="22"/>
           <w:szCs w:val="22"/>
         </w:rPr>
+        <w:lastRenderedPageBreak/>
         <w:t xml:space="preserve">Síntesis. </w:t>
       </w:r>
       <w:r>
@@ -4618,9 +4071,31 @@
           <w:sz w:val="22"/>
           <w:szCs w:val="22"/>
         </w:rPr>
-        <w:t xml:space="preserve">Generative artificial </w:t>
-      </w:r>
-      <w:proofErr w:type="spellStart"/>
+        <w:t>Generative artificial intelligence for enterprise platforms</w:t>
+      </w:r>
+      <w:r>
+        <w:rPr>
+          <w:rFonts w:ascii="Arial" w:eastAsia="Arial" w:hAnsi="Arial" w:cs="Arial"/>
+          <w:sz w:val="22"/>
+          <w:szCs w:val="22"/>
+        </w:rPr>
+        <w:t>. 32nd European Conference on Information Systems (ECIS 2024), Pafos, Chipre.</w:t>
+      </w:r>
+    </w:p>
+    <w:p>
+      <w:pPr>
+        <w:spacing w:after="200" w:line="276" w:lineRule="auto"/>
+        <w:ind w:left="720" w:hanging="720"/>
+        <w:jc w:val="both"/>
+      </w:pPr>
+      <w:r>
+        <w:rPr>
+          <w:rFonts w:ascii="Arial" w:eastAsia="Arial" w:hAnsi="Arial" w:cs="Arial"/>
+          <w:sz w:val="22"/>
+          <w:szCs w:val="22"/>
+        </w:rPr>
+        <w:t xml:space="preserve">Jarzębowicz, A., Przybyłek, A., Estima, J., Ng, Y. Y., Swacha, J., Zielosko, B., Madeyski, L., Carroll, N., Kemell, K.-K., Marcinkowski, B., Rodrigues da Silva, A., Stray, V., Iivari, N., Nguyen-Duc, A., Melegati, J., Delibašić, B., &amp; Insfran, E. (2025). </w:t>
+      </w:r>
       <w:r>
         <w:rPr>
           <w:rFonts w:ascii="Arial" w:eastAsia="Arial" w:hAnsi="Arial" w:cs="Arial"/>
@@ -4629,9 +4104,31 @@
           <w:sz w:val="22"/>
           <w:szCs w:val="22"/>
         </w:rPr>
-        <w:t>intelligence</w:t>
-      </w:r>
-      <w:proofErr w:type="spellEnd"/>
+        <w:t>The landscape of generative AI in information systems: A synthesis of secondary reviews and research agendas</w:t>
+      </w:r>
+      <w:r>
+        <w:rPr>
+          <w:rFonts w:ascii="Arial" w:eastAsia="Arial" w:hAnsi="Arial" w:cs="Arial"/>
+          <w:sz w:val="22"/>
+          <w:szCs w:val="22"/>
+        </w:rPr>
+        <w:t>. Departamento de Ingeniería de Software, Universidad Tecnológica de Gdańsk.</w:t>
+      </w:r>
+    </w:p>
+    <w:p>
+      <w:pPr>
+        <w:spacing w:after="200" w:line="276" w:lineRule="auto"/>
+        <w:ind w:left="720" w:hanging="720"/>
+        <w:jc w:val="both"/>
+      </w:pPr>
+      <w:r>
+        <w:rPr>
+          <w:rFonts w:ascii="Arial" w:eastAsia="Arial" w:hAnsi="Arial" w:cs="Arial"/>
+          <w:sz w:val="22"/>
+          <w:szCs w:val="22"/>
+        </w:rPr>
+        <w:t xml:space="preserve">Rother, B. (2025). </w:t>
+      </w:r>
       <w:r>
         <w:rPr>
           <w:rFonts w:ascii="Arial" w:eastAsia="Arial" w:hAnsi="Arial" w:cs="Arial"/>
@@ -4640,9 +4137,31 @@
           <w:sz w:val="22"/>
           <w:szCs w:val="22"/>
         </w:rPr>
-        <w:t xml:space="preserve"> </w:t>
-      </w:r>
-      <w:proofErr w:type="spellStart"/>
+        <w:t>A systematic literature review on implications of generative AI for IT management</w:t>
+      </w:r>
+      <w:r>
+        <w:rPr>
+          <w:rFonts w:ascii="Arial" w:eastAsia="Arial" w:hAnsi="Arial" w:cs="Arial"/>
+          <w:sz w:val="22"/>
+          <w:szCs w:val="22"/>
+        </w:rPr>
+        <w:t>. FH Wedel, Alemania.</w:t>
+      </w:r>
+    </w:p>
+    <w:p>
+      <w:pPr>
+        <w:spacing w:after="200" w:line="276" w:lineRule="auto"/>
+        <w:ind w:left="720" w:hanging="720"/>
+        <w:jc w:val="both"/>
+      </w:pPr>
+      <w:r>
+        <w:rPr>
+          <w:rFonts w:ascii="Arial" w:eastAsia="Arial" w:hAnsi="Arial" w:cs="Arial"/>
+          <w:sz w:val="22"/>
+          <w:szCs w:val="22"/>
+        </w:rPr>
+        <w:t xml:space="preserve">Tewari, V., Al Alawi, A. S., &amp; Morande, S. (2026). Generative artificial intelligence adoption in emerging economies: A technology-organization-environment framework analysis of large language model integration in small and medium enterprises. </w:t>
+      </w:r>
       <w:r>
         <w:rPr>
           <w:rFonts w:ascii="Arial" w:eastAsia="Arial" w:hAnsi="Arial" w:cs="Arial"/>
@@ -4651,9 +4170,16 @@
           <w:sz w:val="22"/>
           <w:szCs w:val="22"/>
         </w:rPr>
-        <w:t>for</w:t>
-      </w:r>
-      <w:proofErr w:type="spellEnd"/>
+        <w:t>International Journal of Research and Innovation in Social Science</w:t>
+      </w:r>
+      <w:r>
+        <w:rPr>
+          <w:rFonts w:ascii="Arial" w:eastAsia="Arial" w:hAnsi="Arial" w:cs="Arial"/>
+          <w:sz w:val="22"/>
+          <w:szCs w:val="22"/>
+        </w:rPr>
+        <w:t xml:space="preserve">, </w:t>
+      </w:r>
       <w:r>
         <w:rPr>
           <w:rFonts w:ascii="Arial" w:eastAsia="Arial" w:hAnsi="Arial" w:cs="Arial"/>
@@ -4662,9 +4188,31 @@
           <w:sz w:val="22"/>
           <w:szCs w:val="22"/>
         </w:rPr>
-        <w:t xml:space="preserve"> </w:t>
-      </w:r>
-      <w:proofErr w:type="spellStart"/>
+        <w:t>10</w:t>
+      </w:r>
+      <w:r>
+        <w:rPr>
+          <w:rFonts w:ascii="Arial" w:eastAsia="Arial" w:hAnsi="Arial" w:cs="Arial"/>
+          <w:sz w:val="22"/>
+          <w:szCs w:val="22"/>
+        </w:rPr>
+        <w:t>(19), 516–528. https://doi.org/10.47772/IJRISS.2026.10190045</w:t>
+      </w:r>
+    </w:p>
+    <w:p>
+      <w:pPr>
+        <w:spacing w:after="200" w:line="276" w:lineRule="auto"/>
+        <w:ind w:left="720" w:hanging="720"/>
+        <w:jc w:val="both"/>
+      </w:pPr>
+      <w:r>
+        <w:rPr>
+          <w:rFonts w:ascii="Arial" w:eastAsia="Arial" w:hAnsi="Arial" w:cs="Arial"/>
+          <w:sz w:val="22"/>
+          <w:szCs w:val="22"/>
+        </w:rPr>
+        <w:t xml:space="preserve">Wessel, M., Adam, M., Benlian, A., Majchrzak, A., &amp; Thies, F. (2025). Generative AI and its transformative value for digital platforms. </w:t>
+      </w:r>
       <w:r>
         <w:rPr>
           <w:rFonts w:ascii="Arial" w:eastAsia="Arial" w:hAnsi="Arial" w:cs="Arial"/>
@@ -4673,9 +4221,16 @@
           <w:sz w:val="22"/>
           <w:szCs w:val="22"/>
         </w:rPr>
-        <w:t>enterprise</w:t>
-      </w:r>
-      <w:proofErr w:type="spellEnd"/>
+        <w:t>Journal of Management Information Systems</w:t>
+      </w:r>
+      <w:r>
+        <w:rPr>
+          <w:rFonts w:ascii="Arial" w:eastAsia="Arial" w:hAnsi="Arial" w:cs="Arial"/>
+          <w:sz w:val="22"/>
+          <w:szCs w:val="22"/>
+        </w:rPr>
+        <w:t xml:space="preserve">, </w:t>
+      </w:r>
       <w:r>
         <w:rPr>
           <w:rFonts w:ascii="Arial" w:eastAsia="Arial" w:hAnsi="Arial" w:cs="Arial"/>
@@ -4684,1313 +4239,6 @@
           <w:sz w:val="22"/>
           <w:szCs w:val="22"/>
         </w:rPr>
-        <w:t xml:space="preserve"> </w:t>
-      </w:r>
-      <w:proofErr w:type="spellStart"/>
-      <w:r>
-        <w:rPr>
-          <w:rFonts w:ascii="Arial" w:eastAsia="Arial" w:hAnsi="Arial" w:cs="Arial"/>
-          <w:i/>
-          <w:iCs/>
-          <w:sz w:val="22"/>
-          <w:szCs w:val="22"/>
-        </w:rPr>
-        <w:t>platforms</w:t>
-      </w:r>
-      <w:proofErr w:type="spellEnd"/>
-      <w:r>
-        <w:rPr>
-          <w:rFonts w:ascii="Arial" w:eastAsia="Arial" w:hAnsi="Arial" w:cs="Arial"/>
-          <w:sz w:val="22"/>
-          <w:szCs w:val="22"/>
-        </w:rPr>
-        <w:t xml:space="preserve">. 32nd </w:t>
-      </w:r>
-      <w:proofErr w:type="spellStart"/>
-      <w:r>
-        <w:rPr>
-          <w:rFonts w:ascii="Arial" w:eastAsia="Arial" w:hAnsi="Arial" w:cs="Arial"/>
-          <w:sz w:val="22"/>
-          <w:szCs w:val="22"/>
-        </w:rPr>
-        <w:t>European</w:t>
-      </w:r>
-      <w:proofErr w:type="spellEnd"/>
-      <w:r>
-        <w:rPr>
-          <w:rFonts w:ascii="Arial" w:eastAsia="Arial" w:hAnsi="Arial" w:cs="Arial"/>
-          <w:sz w:val="22"/>
-          <w:szCs w:val="22"/>
-        </w:rPr>
-        <w:t xml:space="preserve"> </w:t>
-      </w:r>
-      <w:proofErr w:type="spellStart"/>
-      <w:r>
-        <w:rPr>
-          <w:rFonts w:ascii="Arial" w:eastAsia="Arial" w:hAnsi="Arial" w:cs="Arial"/>
-          <w:sz w:val="22"/>
-          <w:szCs w:val="22"/>
-        </w:rPr>
-        <w:t>Conference</w:t>
-      </w:r>
-      <w:proofErr w:type="spellEnd"/>
-      <w:r>
-        <w:rPr>
-          <w:rFonts w:ascii="Arial" w:eastAsia="Arial" w:hAnsi="Arial" w:cs="Arial"/>
-          <w:sz w:val="22"/>
-          <w:szCs w:val="22"/>
-        </w:rPr>
-        <w:t xml:space="preserve"> </w:t>
-      </w:r>
-      <w:proofErr w:type="spellStart"/>
-      <w:r>
-        <w:rPr>
-          <w:rFonts w:ascii="Arial" w:eastAsia="Arial" w:hAnsi="Arial" w:cs="Arial"/>
-          <w:sz w:val="22"/>
-          <w:szCs w:val="22"/>
-        </w:rPr>
-        <w:t>on</w:t>
-      </w:r>
-      <w:proofErr w:type="spellEnd"/>
-      <w:r>
-        <w:rPr>
-          <w:rFonts w:ascii="Arial" w:eastAsia="Arial" w:hAnsi="Arial" w:cs="Arial"/>
-          <w:sz w:val="22"/>
-          <w:szCs w:val="22"/>
-        </w:rPr>
-        <w:t xml:space="preserve"> </w:t>
-      </w:r>
-      <w:proofErr w:type="spellStart"/>
-      <w:r>
-        <w:rPr>
-          <w:rFonts w:ascii="Arial" w:eastAsia="Arial" w:hAnsi="Arial" w:cs="Arial"/>
-          <w:sz w:val="22"/>
-          <w:szCs w:val="22"/>
-        </w:rPr>
-        <w:t>Information</w:t>
-      </w:r>
-      <w:proofErr w:type="spellEnd"/>
-      <w:r>
-        <w:rPr>
-          <w:rFonts w:ascii="Arial" w:eastAsia="Arial" w:hAnsi="Arial" w:cs="Arial"/>
-          <w:sz w:val="22"/>
-          <w:szCs w:val="22"/>
-        </w:rPr>
-        <w:t xml:space="preserve"> </w:t>
-      </w:r>
-      <w:proofErr w:type="spellStart"/>
-      <w:r>
-        <w:rPr>
-          <w:rFonts w:ascii="Arial" w:eastAsia="Arial" w:hAnsi="Arial" w:cs="Arial"/>
-          <w:sz w:val="22"/>
-          <w:szCs w:val="22"/>
-        </w:rPr>
-        <w:t>Systems</w:t>
-      </w:r>
-      <w:proofErr w:type="spellEnd"/>
-      <w:r>
-        <w:rPr>
-          <w:rFonts w:ascii="Arial" w:eastAsia="Arial" w:hAnsi="Arial" w:cs="Arial"/>
-          <w:sz w:val="22"/>
-          <w:szCs w:val="22"/>
-        </w:rPr>
-        <w:t xml:space="preserve"> (ECIS 2024), Pafos, Chipre.</w:t>
-      </w:r>
-    </w:p>
-    <w:p>
-      <w:pPr>
-        <w:spacing w:after="200" w:line="276" w:lineRule="auto"/>
-        <w:ind w:left="720" w:hanging="720"/>
-        <w:jc w:val="both"/>
-      </w:pPr>
-      <w:r>
-        <w:rPr>
-          <w:rFonts w:ascii="Arial" w:eastAsia="Arial" w:hAnsi="Arial" w:cs="Arial"/>
-          <w:sz w:val="22"/>
-          <w:szCs w:val="22"/>
-        </w:rPr>
-        <w:t xml:space="preserve">Jarzębowicz, A., </w:t>
-      </w:r>
-      <w:proofErr w:type="spellStart"/>
-      <w:r>
-        <w:rPr>
-          <w:rFonts w:ascii="Arial" w:eastAsia="Arial" w:hAnsi="Arial" w:cs="Arial"/>
-          <w:sz w:val="22"/>
-          <w:szCs w:val="22"/>
-        </w:rPr>
-        <w:t>Przybyłek</w:t>
-      </w:r>
-      <w:proofErr w:type="spellEnd"/>
-      <w:r>
-        <w:rPr>
-          <w:rFonts w:ascii="Arial" w:eastAsia="Arial" w:hAnsi="Arial" w:cs="Arial"/>
-          <w:sz w:val="22"/>
-          <w:szCs w:val="22"/>
-        </w:rPr>
-        <w:t xml:space="preserve">, A., Estima, J., Ng, Y. Y., </w:t>
-      </w:r>
-      <w:proofErr w:type="spellStart"/>
-      <w:r>
-        <w:rPr>
-          <w:rFonts w:ascii="Arial" w:eastAsia="Arial" w:hAnsi="Arial" w:cs="Arial"/>
-          <w:sz w:val="22"/>
-          <w:szCs w:val="22"/>
-        </w:rPr>
-        <w:t>Swacha</w:t>
-      </w:r>
-      <w:proofErr w:type="spellEnd"/>
-      <w:r>
-        <w:rPr>
-          <w:rFonts w:ascii="Arial" w:eastAsia="Arial" w:hAnsi="Arial" w:cs="Arial"/>
-          <w:sz w:val="22"/>
-          <w:szCs w:val="22"/>
-        </w:rPr>
-        <w:t xml:space="preserve">, J., Zielosko, B., </w:t>
-      </w:r>
-      <w:proofErr w:type="spellStart"/>
-      <w:r>
-        <w:rPr>
-          <w:rFonts w:ascii="Arial" w:eastAsia="Arial" w:hAnsi="Arial" w:cs="Arial"/>
-          <w:sz w:val="22"/>
-          <w:szCs w:val="22"/>
-        </w:rPr>
-        <w:t>Madeyski</w:t>
-      </w:r>
-      <w:proofErr w:type="spellEnd"/>
-      <w:r>
-        <w:rPr>
-          <w:rFonts w:ascii="Arial" w:eastAsia="Arial" w:hAnsi="Arial" w:cs="Arial"/>
-          <w:sz w:val="22"/>
-          <w:szCs w:val="22"/>
-        </w:rPr>
-        <w:t xml:space="preserve">, L., Carroll, N., </w:t>
-      </w:r>
-      <w:proofErr w:type="spellStart"/>
-      <w:r>
-        <w:rPr>
-          <w:rFonts w:ascii="Arial" w:eastAsia="Arial" w:hAnsi="Arial" w:cs="Arial"/>
-          <w:sz w:val="22"/>
-          <w:szCs w:val="22"/>
-        </w:rPr>
-        <w:t>Kemell</w:t>
-      </w:r>
-      <w:proofErr w:type="spellEnd"/>
-      <w:r>
-        <w:rPr>
-          <w:rFonts w:ascii="Arial" w:eastAsia="Arial" w:hAnsi="Arial" w:cs="Arial"/>
-          <w:sz w:val="22"/>
-          <w:szCs w:val="22"/>
-        </w:rPr>
-        <w:t xml:space="preserve">, K.-K., Marcinkowski, B., </w:t>
-      </w:r>
-      <w:proofErr w:type="spellStart"/>
-      <w:r>
-        <w:rPr>
-          <w:rFonts w:ascii="Arial" w:eastAsia="Arial" w:hAnsi="Arial" w:cs="Arial"/>
-          <w:sz w:val="22"/>
-          <w:szCs w:val="22"/>
-        </w:rPr>
-        <w:t>Rodrigues</w:t>
-      </w:r>
-      <w:proofErr w:type="spellEnd"/>
-      <w:r>
-        <w:rPr>
-          <w:rFonts w:ascii="Arial" w:eastAsia="Arial" w:hAnsi="Arial" w:cs="Arial"/>
-          <w:sz w:val="22"/>
-          <w:szCs w:val="22"/>
-        </w:rPr>
-        <w:t xml:space="preserve"> da Silva, A., Stray, V., Iivari, N., Nguyen-Duc, A., </w:t>
-      </w:r>
-      <w:proofErr w:type="spellStart"/>
-      <w:r>
-        <w:rPr>
-          <w:rFonts w:ascii="Arial" w:eastAsia="Arial" w:hAnsi="Arial" w:cs="Arial"/>
-          <w:sz w:val="22"/>
-          <w:szCs w:val="22"/>
-        </w:rPr>
-        <w:t>Melegati</w:t>
-      </w:r>
-      <w:proofErr w:type="spellEnd"/>
-      <w:r>
-        <w:rPr>
-          <w:rFonts w:ascii="Arial" w:eastAsia="Arial" w:hAnsi="Arial" w:cs="Arial"/>
-          <w:sz w:val="22"/>
-          <w:szCs w:val="22"/>
-        </w:rPr>
-        <w:t xml:space="preserve">, J., Delibašić, B., &amp; </w:t>
-      </w:r>
-      <w:proofErr w:type="spellStart"/>
-      <w:r>
-        <w:rPr>
-          <w:rFonts w:ascii="Arial" w:eastAsia="Arial" w:hAnsi="Arial" w:cs="Arial"/>
-          <w:sz w:val="22"/>
-          <w:szCs w:val="22"/>
-        </w:rPr>
-        <w:t>Insfran</w:t>
-      </w:r>
-      <w:proofErr w:type="spellEnd"/>
-      <w:r>
-        <w:rPr>
-          <w:rFonts w:ascii="Arial" w:eastAsia="Arial" w:hAnsi="Arial" w:cs="Arial"/>
-          <w:sz w:val="22"/>
-          <w:szCs w:val="22"/>
-        </w:rPr>
-        <w:t xml:space="preserve">, E. (2025). </w:t>
-      </w:r>
-      <w:r>
-        <w:rPr>
-          <w:rFonts w:ascii="Arial" w:eastAsia="Arial" w:hAnsi="Arial" w:cs="Arial"/>
-          <w:i/>
-          <w:iCs/>
-          <w:sz w:val="22"/>
-          <w:szCs w:val="22"/>
-        </w:rPr>
-        <w:t xml:space="preserve">The </w:t>
-      </w:r>
-      <w:proofErr w:type="spellStart"/>
-      <w:r>
-        <w:rPr>
-          <w:rFonts w:ascii="Arial" w:eastAsia="Arial" w:hAnsi="Arial" w:cs="Arial"/>
-          <w:i/>
-          <w:iCs/>
-          <w:sz w:val="22"/>
-          <w:szCs w:val="22"/>
-        </w:rPr>
-        <w:t>landscape</w:t>
-      </w:r>
-      <w:proofErr w:type="spellEnd"/>
-      <w:r>
-        <w:rPr>
-          <w:rFonts w:ascii="Arial" w:eastAsia="Arial" w:hAnsi="Arial" w:cs="Arial"/>
-          <w:i/>
-          <w:iCs/>
-          <w:sz w:val="22"/>
-          <w:szCs w:val="22"/>
-        </w:rPr>
-        <w:t xml:space="preserve"> </w:t>
-      </w:r>
-      <w:proofErr w:type="spellStart"/>
-      <w:r>
-        <w:rPr>
-          <w:rFonts w:ascii="Arial" w:eastAsia="Arial" w:hAnsi="Arial" w:cs="Arial"/>
-          <w:i/>
-          <w:iCs/>
-          <w:sz w:val="22"/>
-          <w:szCs w:val="22"/>
-        </w:rPr>
-        <w:t>of</w:t>
-      </w:r>
-      <w:proofErr w:type="spellEnd"/>
-      <w:r>
-        <w:rPr>
-          <w:rFonts w:ascii="Arial" w:eastAsia="Arial" w:hAnsi="Arial" w:cs="Arial"/>
-          <w:i/>
-          <w:iCs/>
-          <w:sz w:val="22"/>
-          <w:szCs w:val="22"/>
-        </w:rPr>
-        <w:t xml:space="preserve"> generative AI in </w:t>
-      </w:r>
-      <w:proofErr w:type="spellStart"/>
-      <w:r>
-        <w:rPr>
-          <w:rFonts w:ascii="Arial" w:eastAsia="Arial" w:hAnsi="Arial" w:cs="Arial"/>
-          <w:i/>
-          <w:iCs/>
-          <w:sz w:val="22"/>
-          <w:szCs w:val="22"/>
-        </w:rPr>
-        <w:t>information</w:t>
-      </w:r>
-      <w:proofErr w:type="spellEnd"/>
-      <w:r>
-        <w:rPr>
-          <w:rFonts w:ascii="Arial" w:eastAsia="Arial" w:hAnsi="Arial" w:cs="Arial"/>
-          <w:i/>
-          <w:iCs/>
-          <w:sz w:val="22"/>
-          <w:szCs w:val="22"/>
-        </w:rPr>
-        <w:t xml:space="preserve"> </w:t>
-      </w:r>
-      <w:proofErr w:type="spellStart"/>
-      <w:r>
-        <w:rPr>
-          <w:rFonts w:ascii="Arial" w:eastAsia="Arial" w:hAnsi="Arial" w:cs="Arial"/>
-          <w:i/>
-          <w:iCs/>
-          <w:sz w:val="22"/>
-          <w:szCs w:val="22"/>
-        </w:rPr>
-        <w:t>systems</w:t>
-      </w:r>
-      <w:proofErr w:type="spellEnd"/>
-      <w:r>
-        <w:rPr>
-          <w:rFonts w:ascii="Arial" w:eastAsia="Arial" w:hAnsi="Arial" w:cs="Arial"/>
-          <w:i/>
-          <w:iCs/>
-          <w:sz w:val="22"/>
-          <w:szCs w:val="22"/>
-        </w:rPr>
-        <w:t xml:space="preserve">: A </w:t>
-      </w:r>
-      <w:proofErr w:type="spellStart"/>
-      <w:r>
-        <w:rPr>
-          <w:rFonts w:ascii="Arial" w:eastAsia="Arial" w:hAnsi="Arial" w:cs="Arial"/>
-          <w:i/>
-          <w:iCs/>
-          <w:sz w:val="22"/>
-          <w:szCs w:val="22"/>
-        </w:rPr>
-        <w:t>synthesis</w:t>
-      </w:r>
-      <w:proofErr w:type="spellEnd"/>
-      <w:r>
-        <w:rPr>
-          <w:rFonts w:ascii="Arial" w:eastAsia="Arial" w:hAnsi="Arial" w:cs="Arial"/>
-          <w:i/>
-          <w:iCs/>
-          <w:sz w:val="22"/>
-          <w:szCs w:val="22"/>
-        </w:rPr>
-        <w:t xml:space="preserve"> </w:t>
-      </w:r>
-      <w:proofErr w:type="spellStart"/>
-      <w:r>
-        <w:rPr>
-          <w:rFonts w:ascii="Arial" w:eastAsia="Arial" w:hAnsi="Arial" w:cs="Arial"/>
-          <w:i/>
-          <w:iCs/>
-          <w:sz w:val="22"/>
-          <w:szCs w:val="22"/>
-        </w:rPr>
-        <w:t>of</w:t>
-      </w:r>
-      <w:proofErr w:type="spellEnd"/>
-      <w:r>
-        <w:rPr>
-          <w:rFonts w:ascii="Arial" w:eastAsia="Arial" w:hAnsi="Arial" w:cs="Arial"/>
-          <w:i/>
-          <w:iCs/>
-          <w:sz w:val="22"/>
-          <w:szCs w:val="22"/>
-        </w:rPr>
-        <w:t xml:space="preserve"> </w:t>
-      </w:r>
-      <w:proofErr w:type="spellStart"/>
-      <w:r>
-        <w:rPr>
-          <w:rFonts w:ascii="Arial" w:eastAsia="Arial" w:hAnsi="Arial" w:cs="Arial"/>
-          <w:i/>
-          <w:iCs/>
-          <w:sz w:val="22"/>
-          <w:szCs w:val="22"/>
-        </w:rPr>
-        <w:t>secondary</w:t>
-      </w:r>
-      <w:proofErr w:type="spellEnd"/>
-      <w:r>
-        <w:rPr>
-          <w:rFonts w:ascii="Arial" w:eastAsia="Arial" w:hAnsi="Arial" w:cs="Arial"/>
-          <w:i/>
-          <w:iCs/>
-          <w:sz w:val="22"/>
-          <w:szCs w:val="22"/>
-        </w:rPr>
-        <w:t xml:space="preserve"> </w:t>
-      </w:r>
-      <w:proofErr w:type="spellStart"/>
-      <w:r>
-        <w:rPr>
-          <w:rFonts w:ascii="Arial" w:eastAsia="Arial" w:hAnsi="Arial" w:cs="Arial"/>
-          <w:i/>
-          <w:iCs/>
-          <w:sz w:val="22"/>
-          <w:szCs w:val="22"/>
-        </w:rPr>
-        <w:t>reviews</w:t>
-      </w:r>
-      <w:proofErr w:type="spellEnd"/>
-      <w:r>
-        <w:rPr>
-          <w:rFonts w:ascii="Arial" w:eastAsia="Arial" w:hAnsi="Arial" w:cs="Arial"/>
-          <w:i/>
-          <w:iCs/>
-          <w:sz w:val="22"/>
-          <w:szCs w:val="22"/>
-        </w:rPr>
-        <w:t xml:space="preserve"> and </w:t>
-      </w:r>
-      <w:proofErr w:type="spellStart"/>
-      <w:r>
-        <w:rPr>
-          <w:rFonts w:ascii="Arial" w:eastAsia="Arial" w:hAnsi="Arial" w:cs="Arial"/>
-          <w:i/>
-          <w:iCs/>
-          <w:sz w:val="22"/>
-          <w:szCs w:val="22"/>
-        </w:rPr>
-        <w:t>research</w:t>
-      </w:r>
-      <w:proofErr w:type="spellEnd"/>
-      <w:r>
-        <w:rPr>
-          <w:rFonts w:ascii="Arial" w:eastAsia="Arial" w:hAnsi="Arial" w:cs="Arial"/>
-          <w:i/>
-          <w:iCs/>
-          <w:sz w:val="22"/>
-          <w:szCs w:val="22"/>
-        </w:rPr>
-        <w:t xml:space="preserve"> agendas</w:t>
-      </w:r>
-      <w:r>
-        <w:rPr>
-          <w:rFonts w:ascii="Arial" w:eastAsia="Arial" w:hAnsi="Arial" w:cs="Arial"/>
-          <w:sz w:val="22"/>
-          <w:szCs w:val="22"/>
-        </w:rPr>
-        <w:t xml:space="preserve">. Departamento de Ingeniería de Software, Universidad Tecnológica de </w:t>
-      </w:r>
-      <w:proofErr w:type="spellStart"/>
-      <w:r>
-        <w:rPr>
-          <w:rFonts w:ascii="Arial" w:eastAsia="Arial" w:hAnsi="Arial" w:cs="Arial"/>
-          <w:sz w:val="22"/>
-          <w:szCs w:val="22"/>
-        </w:rPr>
-        <w:t>Gdańsk</w:t>
-      </w:r>
-      <w:proofErr w:type="spellEnd"/>
-      <w:r>
-        <w:rPr>
-          <w:rFonts w:ascii="Arial" w:eastAsia="Arial" w:hAnsi="Arial" w:cs="Arial"/>
-          <w:sz w:val="22"/>
-          <w:szCs w:val="22"/>
-        </w:rPr>
-        <w:t>.</w:t>
-      </w:r>
-    </w:p>
-    <w:p>
-      <w:pPr>
-        <w:spacing w:after="200" w:line="276" w:lineRule="auto"/>
-        <w:ind w:left="720" w:hanging="720"/>
-        <w:jc w:val="both"/>
-      </w:pPr>
-      <w:r>
-        <w:rPr>
-          <w:rFonts w:ascii="Arial" w:eastAsia="Arial" w:hAnsi="Arial" w:cs="Arial"/>
-          <w:sz w:val="22"/>
-          <w:szCs w:val="22"/>
-        </w:rPr>
-        <w:t xml:space="preserve">Rother, B. (2025). </w:t>
-      </w:r>
-      <w:r>
-        <w:rPr>
-          <w:rFonts w:ascii="Arial" w:eastAsia="Arial" w:hAnsi="Arial" w:cs="Arial"/>
-          <w:i/>
-          <w:iCs/>
-          <w:sz w:val="22"/>
-          <w:szCs w:val="22"/>
-        </w:rPr>
-        <w:t xml:space="preserve">A </w:t>
-      </w:r>
-      <w:proofErr w:type="spellStart"/>
-      <w:r>
-        <w:rPr>
-          <w:rFonts w:ascii="Arial" w:eastAsia="Arial" w:hAnsi="Arial" w:cs="Arial"/>
-          <w:i/>
-          <w:iCs/>
-          <w:sz w:val="22"/>
-          <w:szCs w:val="22"/>
-        </w:rPr>
-        <w:t>systematic</w:t>
-      </w:r>
-      <w:proofErr w:type="spellEnd"/>
-      <w:r>
-        <w:rPr>
-          <w:rFonts w:ascii="Arial" w:eastAsia="Arial" w:hAnsi="Arial" w:cs="Arial"/>
-          <w:i/>
-          <w:iCs/>
-          <w:sz w:val="22"/>
-          <w:szCs w:val="22"/>
-        </w:rPr>
-        <w:t xml:space="preserve"> </w:t>
-      </w:r>
-      <w:proofErr w:type="spellStart"/>
-      <w:r>
-        <w:rPr>
-          <w:rFonts w:ascii="Arial" w:eastAsia="Arial" w:hAnsi="Arial" w:cs="Arial"/>
-          <w:i/>
-          <w:iCs/>
-          <w:sz w:val="22"/>
-          <w:szCs w:val="22"/>
-        </w:rPr>
-        <w:t>literature</w:t>
-      </w:r>
-      <w:proofErr w:type="spellEnd"/>
-      <w:r>
-        <w:rPr>
-          <w:rFonts w:ascii="Arial" w:eastAsia="Arial" w:hAnsi="Arial" w:cs="Arial"/>
-          <w:i/>
-          <w:iCs/>
-          <w:sz w:val="22"/>
-          <w:szCs w:val="22"/>
-        </w:rPr>
-        <w:t xml:space="preserve"> </w:t>
-      </w:r>
-      <w:proofErr w:type="spellStart"/>
-      <w:r>
-        <w:rPr>
-          <w:rFonts w:ascii="Arial" w:eastAsia="Arial" w:hAnsi="Arial" w:cs="Arial"/>
-          <w:i/>
-          <w:iCs/>
-          <w:sz w:val="22"/>
-          <w:szCs w:val="22"/>
-        </w:rPr>
-        <w:t>review</w:t>
-      </w:r>
-      <w:proofErr w:type="spellEnd"/>
-      <w:r>
-        <w:rPr>
-          <w:rFonts w:ascii="Arial" w:eastAsia="Arial" w:hAnsi="Arial" w:cs="Arial"/>
-          <w:i/>
-          <w:iCs/>
-          <w:sz w:val="22"/>
-          <w:szCs w:val="22"/>
-        </w:rPr>
-        <w:t xml:space="preserve"> </w:t>
-      </w:r>
-      <w:proofErr w:type="spellStart"/>
-      <w:r>
-        <w:rPr>
-          <w:rFonts w:ascii="Arial" w:eastAsia="Arial" w:hAnsi="Arial" w:cs="Arial"/>
-          <w:i/>
-          <w:iCs/>
-          <w:sz w:val="22"/>
-          <w:szCs w:val="22"/>
-        </w:rPr>
-        <w:t>on</w:t>
-      </w:r>
-      <w:proofErr w:type="spellEnd"/>
-      <w:r>
-        <w:rPr>
-          <w:rFonts w:ascii="Arial" w:eastAsia="Arial" w:hAnsi="Arial" w:cs="Arial"/>
-          <w:i/>
-          <w:iCs/>
-          <w:sz w:val="22"/>
-          <w:szCs w:val="22"/>
-        </w:rPr>
-        <w:t xml:space="preserve"> </w:t>
-      </w:r>
-      <w:proofErr w:type="spellStart"/>
-      <w:r>
-        <w:rPr>
-          <w:rFonts w:ascii="Arial" w:eastAsia="Arial" w:hAnsi="Arial" w:cs="Arial"/>
-          <w:i/>
-          <w:iCs/>
-          <w:sz w:val="22"/>
-          <w:szCs w:val="22"/>
-        </w:rPr>
-        <w:t>implications</w:t>
-      </w:r>
-      <w:proofErr w:type="spellEnd"/>
-      <w:r>
-        <w:rPr>
-          <w:rFonts w:ascii="Arial" w:eastAsia="Arial" w:hAnsi="Arial" w:cs="Arial"/>
-          <w:i/>
-          <w:iCs/>
-          <w:sz w:val="22"/>
-          <w:szCs w:val="22"/>
-        </w:rPr>
-        <w:t xml:space="preserve"> </w:t>
-      </w:r>
-      <w:proofErr w:type="spellStart"/>
-      <w:r>
-        <w:rPr>
-          <w:rFonts w:ascii="Arial" w:eastAsia="Arial" w:hAnsi="Arial" w:cs="Arial"/>
-          <w:i/>
-          <w:iCs/>
-          <w:sz w:val="22"/>
-          <w:szCs w:val="22"/>
-        </w:rPr>
-        <w:t>of</w:t>
-      </w:r>
-      <w:proofErr w:type="spellEnd"/>
-      <w:r>
-        <w:rPr>
-          <w:rFonts w:ascii="Arial" w:eastAsia="Arial" w:hAnsi="Arial" w:cs="Arial"/>
-          <w:i/>
-          <w:iCs/>
-          <w:sz w:val="22"/>
-          <w:szCs w:val="22"/>
-        </w:rPr>
-        <w:t xml:space="preserve"> generative AI </w:t>
-      </w:r>
-      <w:proofErr w:type="spellStart"/>
-      <w:r>
-        <w:rPr>
-          <w:rFonts w:ascii="Arial" w:eastAsia="Arial" w:hAnsi="Arial" w:cs="Arial"/>
-          <w:i/>
-          <w:iCs/>
-          <w:sz w:val="22"/>
-          <w:szCs w:val="22"/>
-        </w:rPr>
-        <w:t>for</w:t>
-      </w:r>
-      <w:proofErr w:type="spellEnd"/>
-      <w:r>
-        <w:rPr>
-          <w:rFonts w:ascii="Arial" w:eastAsia="Arial" w:hAnsi="Arial" w:cs="Arial"/>
-          <w:i/>
-          <w:iCs/>
-          <w:sz w:val="22"/>
-          <w:szCs w:val="22"/>
-        </w:rPr>
-        <w:t xml:space="preserve"> IT </w:t>
-      </w:r>
-      <w:proofErr w:type="spellStart"/>
-      <w:r>
-        <w:rPr>
-          <w:rFonts w:ascii="Arial" w:eastAsia="Arial" w:hAnsi="Arial" w:cs="Arial"/>
-          <w:i/>
-          <w:iCs/>
-          <w:sz w:val="22"/>
-          <w:szCs w:val="22"/>
-        </w:rPr>
-        <w:t>management</w:t>
-      </w:r>
-      <w:proofErr w:type="spellEnd"/>
-      <w:r>
-        <w:rPr>
-          <w:rFonts w:ascii="Arial" w:eastAsia="Arial" w:hAnsi="Arial" w:cs="Arial"/>
-          <w:sz w:val="22"/>
-          <w:szCs w:val="22"/>
-        </w:rPr>
-        <w:t>. FH Wedel, Alemania.</w:t>
-      </w:r>
-    </w:p>
-    <w:p>
-      <w:pPr>
-        <w:spacing w:after="200" w:line="276" w:lineRule="auto"/>
-        <w:ind w:left="720" w:hanging="720"/>
-        <w:jc w:val="both"/>
-      </w:pPr>
-      <w:r>
-        <w:rPr>
-          <w:rFonts w:ascii="Arial" w:eastAsia="Arial" w:hAnsi="Arial" w:cs="Arial"/>
-          <w:sz w:val="22"/>
-          <w:szCs w:val="22"/>
-        </w:rPr>
-        <w:lastRenderedPageBreak/>
-        <w:t xml:space="preserve">Tewari, V., Al Alawi, A. S., &amp; Morande, S. (2026). Generative artificial </w:t>
-      </w:r>
-      <w:proofErr w:type="spellStart"/>
-      <w:r>
-        <w:rPr>
-          <w:rFonts w:ascii="Arial" w:eastAsia="Arial" w:hAnsi="Arial" w:cs="Arial"/>
-          <w:sz w:val="22"/>
-          <w:szCs w:val="22"/>
-        </w:rPr>
-        <w:t>intelligence</w:t>
-      </w:r>
-      <w:proofErr w:type="spellEnd"/>
-      <w:r>
-        <w:rPr>
-          <w:rFonts w:ascii="Arial" w:eastAsia="Arial" w:hAnsi="Arial" w:cs="Arial"/>
-          <w:sz w:val="22"/>
-          <w:szCs w:val="22"/>
-        </w:rPr>
-        <w:t xml:space="preserve"> </w:t>
-      </w:r>
-      <w:proofErr w:type="spellStart"/>
-      <w:r>
-        <w:rPr>
-          <w:rFonts w:ascii="Arial" w:eastAsia="Arial" w:hAnsi="Arial" w:cs="Arial"/>
-          <w:sz w:val="22"/>
-          <w:szCs w:val="22"/>
-        </w:rPr>
-        <w:t>adoption</w:t>
-      </w:r>
-      <w:proofErr w:type="spellEnd"/>
-      <w:r>
-        <w:rPr>
-          <w:rFonts w:ascii="Arial" w:eastAsia="Arial" w:hAnsi="Arial" w:cs="Arial"/>
-          <w:sz w:val="22"/>
-          <w:szCs w:val="22"/>
-        </w:rPr>
-        <w:t xml:space="preserve"> in </w:t>
-      </w:r>
-      <w:proofErr w:type="spellStart"/>
-      <w:r>
-        <w:rPr>
-          <w:rFonts w:ascii="Arial" w:eastAsia="Arial" w:hAnsi="Arial" w:cs="Arial"/>
-          <w:sz w:val="22"/>
-          <w:szCs w:val="22"/>
-        </w:rPr>
-        <w:t>emerging</w:t>
-      </w:r>
-      <w:proofErr w:type="spellEnd"/>
-      <w:r>
-        <w:rPr>
-          <w:rFonts w:ascii="Arial" w:eastAsia="Arial" w:hAnsi="Arial" w:cs="Arial"/>
-          <w:sz w:val="22"/>
-          <w:szCs w:val="22"/>
-        </w:rPr>
-        <w:t xml:space="preserve"> </w:t>
-      </w:r>
-      <w:proofErr w:type="spellStart"/>
-      <w:r>
-        <w:rPr>
-          <w:rFonts w:ascii="Arial" w:eastAsia="Arial" w:hAnsi="Arial" w:cs="Arial"/>
-          <w:sz w:val="22"/>
-          <w:szCs w:val="22"/>
-        </w:rPr>
-        <w:t>economies</w:t>
-      </w:r>
-      <w:proofErr w:type="spellEnd"/>
-      <w:r>
-        <w:rPr>
-          <w:rFonts w:ascii="Arial" w:eastAsia="Arial" w:hAnsi="Arial" w:cs="Arial"/>
-          <w:sz w:val="22"/>
-          <w:szCs w:val="22"/>
-        </w:rPr>
-        <w:t xml:space="preserve">: A </w:t>
-      </w:r>
-      <w:proofErr w:type="spellStart"/>
-      <w:r>
-        <w:rPr>
-          <w:rFonts w:ascii="Arial" w:eastAsia="Arial" w:hAnsi="Arial" w:cs="Arial"/>
-          <w:sz w:val="22"/>
-          <w:szCs w:val="22"/>
-        </w:rPr>
-        <w:t>technology-organization-environment</w:t>
-      </w:r>
-      <w:proofErr w:type="spellEnd"/>
-      <w:r>
-        <w:rPr>
-          <w:rFonts w:ascii="Arial" w:eastAsia="Arial" w:hAnsi="Arial" w:cs="Arial"/>
-          <w:sz w:val="22"/>
-          <w:szCs w:val="22"/>
-        </w:rPr>
-        <w:t xml:space="preserve"> </w:t>
-      </w:r>
-      <w:proofErr w:type="spellStart"/>
-      <w:r>
-        <w:rPr>
-          <w:rFonts w:ascii="Arial" w:eastAsia="Arial" w:hAnsi="Arial" w:cs="Arial"/>
-          <w:sz w:val="22"/>
-          <w:szCs w:val="22"/>
-        </w:rPr>
-        <w:t>framework</w:t>
-      </w:r>
-      <w:proofErr w:type="spellEnd"/>
-      <w:r>
-        <w:rPr>
-          <w:rFonts w:ascii="Arial" w:eastAsia="Arial" w:hAnsi="Arial" w:cs="Arial"/>
-          <w:sz w:val="22"/>
-          <w:szCs w:val="22"/>
-        </w:rPr>
-        <w:t xml:space="preserve"> </w:t>
-      </w:r>
-      <w:proofErr w:type="spellStart"/>
-      <w:r>
-        <w:rPr>
-          <w:rFonts w:ascii="Arial" w:eastAsia="Arial" w:hAnsi="Arial" w:cs="Arial"/>
-          <w:sz w:val="22"/>
-          <w:szCs w:val="22"/>
-        </w:rPr>
-        <w:t>analysis</w:t>
-      </w:r>
-      <w:proofErr w:type="spellEnd"/>
-      <w:r>
-        <w:rPr>
-          <w:rFonts w:ascii="Arial" w:eastAsia="Arial" w:hAnsi="Arial" w:cs="Arial"/>
-          <w:sz w:val="22"/>
-          <w:szCs w:val="22"/>
-        </w:rPr>
-        <w:t xml:space="preserve"> </w:t>
-      </w:r>
-      <w:proofErr w:type="spellStart"/>
-      <w:r>
-        <w:rPr>
-          <w:rFonts w:ascii="Arial" w:eastAsia="Arial" w:hAnsi="Arial" w:cs="Arial"/>
-          <w:sz w:val="22"/>
-          <w:szCs w:val="22"/>
-        </w:rPr>
-        <w:t>of</w:t>
-      </w:r>
-      <w:proofErr w:type="spellEnd"/>
-      <w:r>
-        <w:rPr>
-          <w:rFonts w:ascii="Arial" w:eastAsia="Arial" w:hAnsi="Arial" w:cs="Arial"/>
-          <w:sz w:val="22"/>
-          <w:szCs w:val="22"/>
-        </w:rPr>
-        <w:t xml:space="preserve"> </w:t>
-      </w:r>
-      <w:proofErr w:type="spellStart"/>
-      <w:r>
-        <w:rPr>
-          <w:rFonts w:ascii="Arial" w:eastAsia="Arial" w:hAnsi="Arial" w:cs="Arial"/>
-          <w:sz w:val="22"/>
-          <w:szCs w:val="22"/>
-        </w:rPr>
-        <w:t>large</w:t>
-      </w:r>
-      <w:proofErr w:type="spellEnd"/>
-      <w:r>
-        <w:rPr>
-          <w:rFonts w:ascii="Arial" w:eastAsia="Arial" w:hAnsi="Arial" w:cs="Arial"/>
-          <w:sz w:val="22"/>
-          <w:szCs w:val="22"/>
-        </w:rPr>
-        <w:t xml:space="preserve"> </w:t>
-      </w:r>
-      <w:proofErr w:type="spellStart"/>
-      <w:r>
-        <w:rPr>
-          <w:rFonts w:ascii="Arial" w:eastAsia="Arial" w:hAnsi="Arial" w:cs="Arial"/>
-          <w:sz w:val="22"/>
-          <w:szCs w:val="22"/>
-        </w:rPr>
-        <w:t>language</w:t>
-      </w:r>
-      <w:proofErr w:type="spellEnd"/>
-      <w:r>
-        <w:rPr>
-          <w:rFonts w:ascii="Arial" w:eastAsia="Arial" w:hAnsi="Arial" w:cs="Arial"/>
-          <w:sz w:val="22"/>
-          <w:szCs w:val="22"/>
-        </w:rPr>
-        <w:t xml:space="preserve"> </w:t>
-      </w:r>
-      <w:proofErr w:type="spellStart"/>
-      <w:r>
-        <w:rPr>
-          <w:rFonts w:ascii="Arial" w:eastAsia="Arial" w:hAnsi="Arial" w:cs="Arial"/>
-          <w:sz w:val="22"/>
-          <w:szCs w:val="22"/>
-        </w:rPr>
-        <w:t>model</w:t>
-      </w:r>
-      <w:proofErr w:type="spellEnd"/>
-      <w:r>
-        <w:rPr>
-          <w:rFonts w:ascii="Arial" w:eastAsia="Arial" w:hAnsi="Arial" w:cs="Arial"/>
-          <w:sz w:val="22"/>
-          <w:szCs w:val="22"/>
-        </w:rPr>
-        <w:t xml:space="preserve"> </w:t>
-      </w:r>
-      <w:proofErr w:type="spellStart"/>
-      <w:r>
-        <w:rPr>
-          <w:rFonts w:ascii="Arial" w:eastAsia="Arial" w:hAnsi="Arial" w:cs="Arial"/>
-          <w:sz w:val="22"/>
-          <w:szCs w:val="22"/>
-        </w:rPr>
-        <w:t>integration</w:t>
-      </w:r>
-      <w:proofErr w:type="spellEnd"/>
-      <w:r>
-        <w:rPr>
-          <w:rFonts w:ascii="Arial" w:eastAsia="Arial" w:hAnsi="Arial" w:cs="Arial"/>
-          <w:sz w:val="22"/>
-          <w:szCs w:val="22"/>
-        </w:rPr>
-        <w:t xml:space="preserve"> in </w:t>
-      </w:r>
-      <w:proofErr w:type="spellStart"/>
-      <w:r>
-        <w:rPr>
-          <w:rFonts w:ascii="Arial" w:eastAsia="Arial" w:hAnsi="Arial" w:cs="Arial"/>
-          <w:sz w:val="22"/>
-          <w:szCs w:val="22"/>
-        </w:rPr>
-        <w:t>small</w:t>
-      </w:r>
-      <w:proofErr w:type="spellEnd"/>
-      <w:r>
-        <w:rPr>
-          <w:rFonts w:ascii="Arial" w:eastAsia="Arial" w:hAnsi="Arial" w:cs="Arial"/>
-          <w:sz w:val="22"/>
-          <w:szCs w:val="22"/>
-        </w:rPr>
-        <w:t xml:space="preserve"> and </w:t>
-      </w:r>
-      <w:proofErr w:type="spellStart"/>
-      <w:r>
-        <w:rPr>
-          <w:rFonts w:ascii="Arial" w:eastAsia="Arial" w:hAnsi="Arial" w:cs="Arial"/>
-          <w:sz w:val="22"/>
-          <w:szCs w:val="22"/>
-        </w:rPr>
-        <w:t>medium</w:t>
-      </w:r>
-      <w:proofErr w:type="spellEnd"/>
-      <w:r>
-        <w:rPr>
-          <w:rFonts w:ascii="Arial" w:eastAsia="Arial" w:hAnsi="Arial" w:cs="Arial"/>
-          <w:sz w:val="22"/>
-          <w:szCs w:val="22"/>
-        </w:rPr>
-        <w:t xml:space="preserve"> </w:t>
-      </w:r>
-      <w:proofErr w:type="spellStart"/>
-      <w:r>
-        <w:rPr>
-          <w:rFonts w:ascii="Arial" w:eastAsia="Arial" w:hAnsi="Arial" w:cs="Arial"/>
-          <w:sz w:val="22"/>
-          <w:szCs w:val="22"/>
-        </w:rPr>
-        <w:t>enterprises</w:t>
-      </w:r>
-      <w:proofErr w:type="spellEnd"/>
-      <w:r>
-        <w:rPr>
-          <w:rFonts w:ascii="Arial" w:eastAsia="Arial" w:hAnsi="Arial" w:cs="Arial"/>
-          <w:sz w:val="22"/>
-          <w:szCs w:val="22"/>
-        </w:rPr>
-        <w:t xml:space="preserve">. </w:t>
-      </w:r>
-      <w:r>
-        <w:rPr>
-          <w:rFonts w:ascii="Arial" w:eastAsia="Arial" w:hAnsi="Arial" w:cs="Arial"/>
-          <w:i/>
-          <w:iCs/>
-          <w:sz w:val="22"/>
-          <w:szCs w:val="22"/>
-        </w:rPr>
-        <w:t xml:space="preserve">International </w:t>
-      </w:r>
-      <w:proofErr w:type="spellStart"/>
-      <w:r>
-        <w:rPr>
-          <w:rFonts w:ascii="Arial" w:eastAsia="Arial" w:hAnsi="Arial" w:cs="Arial"/>
-          <w:i/>
-          <w:iCs/>
-          <w:sz w:val="22"/>
-          <w:szCs w:val="22"/>
-        </w:rPr>
-        <w:t>Journal</w:t>
-      </w:r>
-      <w:proofErr w:type="spellEnd"/>
-      <w:r>
-        <w:rPr>
-          <w:rFonts w:ascii="Arial" w:eastAsia="Arial" w:hAnsi="Arial" w:cs="Arial"/>
-          <w:i/>
-          <w:iCs/>
-          <w:sz w:val="22"/>
-          <w:szCs w:val="22"/>
-        </w:rPr>
-        <w:t xml:space="preserve"> </w:t>
-      </w:r>
-      <w:proofErr w:type="spellStart"/>
-      <w:r>
-        <w:rPr>
-          <w:rFonts w:ascii="Arial" w:eastAsia="Arial" w:hAnsi="Arial" w:cs="Arial"/>
-          <w:i/>
-          <w:iCs/>
-          <w:sz w:val="22"/>
-          <w:szCs w:val="22"/>
-        </w:rPr>
-        <w:t>of</w:t>
-      </w:r>
-      <w:proofErr w:type="spellEnd"/>
-      <w:r>
-        <w:rPr>
-          <w:rFonts w:ascii="Arial" w:eastAsia="Arial" w:hAnsi="Arial" w:cs="Arial"/>
-          <w:i/>
-          <w:iCs/>
-          <w:sz w:val="22"/>
-          <w:szCs w:val="22"/>
-        </w:rPr>
-        <w:t xml:space="preserve"> </w:t>
-      </w:r>
-      <w:proofErr w:type="spellStart"/>
-      <w:r>
-        <w:rPr>
-          <w:rFonts w:ascii="Arial" w:eastAsia="Arial" w:hAnsi="Arial" w:cs="Arial"/>
-          <w:i/>
-          <w:iCs/>
-          <w:sz w:val="22"/>
-          <w:szCs w:val="22"/>
-        </w:rPr>
-        <w:t>Research</w:t>
-      </w:r>
-      <w:proofErr w:type="spellEnd"/>
-      <w:r>
-        <w:rPr>
-          <w:rFonts w:ascii="Arial" w:eastAsia="Arial" w:hAnsi="Arial" w:cs="Arial"/>
-          <w:i/>
-          <w:iCs/>
-          <w:sz w:val="22"/>
-          <w:szCs w:val="22"/>
-        </w:rPr>
-        <w:t xml:space="preserve"> and </w:t>
-      </w:r>
-      <w:proofErr w:type="spellStart"/>
-      <w:r>
-        <w:rPr>
-          <w:rFonts w:ascii="Arial" w:eastAsia="Arial" w:hAnsi="Arial" w:cs="Arial"/>
-          <w:i/>
-          <w:iCs/>
-          <w:sz w:val="22"/>
-          <w:szCs w:val="22"/>
-        </w:rPr>
-        <w:t>Innovation</w:t>
-      </w:r>
-      <w:proofErr w:type="spellEnd"/>
-      <w:r>
-        <w:rPr>
-          <w:rFonts w:ascii="Arial" w:eastAsia="Arial" w:hAnsi="Arial" w:cs="Arial"/>
-          <w:i/>
-          <w:iCs/>
-          <w:sz w:val="22"/>
-          <w:szCs w:val="22"/>
-        </w:rPr>
-        <w:t xml:space="preserve"> in Social </w:t>
-      </w:r>
-      <w:proofErr w:type="spellStart"/>
-      <w:r>
-        <w:rPr>
-          <w:rFonts w:ascii="Arial" w:eastAsia="Arial" w:hAnsi="Arial" w:cs="Arial"/>
-          <w:i/>
-          <w:iCs/>
-          <w:sz w:val="22"/>
-          <w:szCs w:val="22"/>
-        </w:rPr>
-        <w:t>Science</w:t>
-      </w:r>
-      <w:proofErr w:type="spellEnd"/>
-      <w:r>
-        <w:rPr>
-          <w:rFonts w:ascii="Arial" w:eastAsia="Arial" w:hAnsi="Arial" w:cs="Arial"/>
-          <w:sz w:val="22"/>
-          <w:szCs w:val="22"/>
-        </w:rPr>
-        <w:t xml:space="preserve">, </w:t>
-      </w:r>
-      <w:r>
-        <w:rPr>
-          <w:rFonts w:ascii="Arial" w:eastAsia="Arial" w:hAnsi="Arial" w:cs="Arial"/>
-          <w:i/>
-          <w:iCs/>
-          <w:sz w:val="22"/>
-          <w:szCs w:val="22"/>
-        </w:rPr>
-        <w:t>10</w:t>
-      </w:r>
-      <w:r>
-        <w:rPr>
-          <w:rFonts w:ascii="Arial" w:eastAsia="Arial" w:hAnsi="Arial" w:cs="Arial"/>
-          <w:sz w:val="22"/>
-          <w:szCs w:val="22"/>
-        </w:rPr>
-        <w:t>(19), 516–528. https://doi.org/10.47772/IJRISS.2026.10190045</w:t>
-      </w:r>
-    </w:p>
-    <w:p>
-      <w:pPr>
-        <w:spacing w:after="200" w:line="276" w:lineRule="auto"/>
-        <w:ind w:left="720" w:hanging="720"/>
-        <w:jc w:val="both"/>
-      </w:pPr>
-      <w:r>
-        <w:rPr>
-          <w:rFonts w:ascii="Arial" w:eastAsia="Arial" w:hAnsi="Arial" w:cs="Arial"/>
-          <w:sz w:val="22"/>
-          <w:szCs w:val="22"/>
-        </w:rPr>
-        <w:t xml:space="preserve">Wessel, M., Adam, M., </w:t>
-      </w:r>
-      <w:proofErr w:type="spellStart"/>
-      <w:r>
-        <w:rPr>
-          <w:rFonts w:ascii="Arial" w:eastAsia="Arial" w:hAnsi="Arial" w:cs="Arial"/>
-          <w:sz w:val="22"/>
-          <w:szCs w:val="22"/>
-        </w:rPr>
-        <w:t>Benlian</w:t>
-      </w:r>
-      <w:proofErr w:type="spellEnd"/>
-      <w:r>
-        <w:rPr>
-          <w:rFonts w:ascii="Arial" w:eastAsia="Arial" w:hAnsi="Arial" w:cs="Arial"/>
-          <w:sz w:val="22"/>
-          <w:szCs w:val="22"/>
-        </w:rPr>
-        <w:t xml:space="preserve">, A., Majchrzak, A., &amp; Thies, F. (2025). Generative AI and </w:t>
-      </w:r>
-      <w:proofErr w:type="spellStart"/>
-      <w:r>
-        <w:rPr>
-          <w:rFonts w:ascii="Arial" w:eastAsia="Arial" w:hAnsi="Arial" w:cs="Arial"/>
-          <w:sz w:val="22"/>
-          <w:szCs w:val="22"/>
-        </w:rPr>
-        <w:t>its</w:t>
-      </w:r>
-      <w:proofErr w:type="spellEnd"/>
-      <w:r>
-        <w:rPr>
-          <w:rFonts w:ascii="Arial" w:eastAsia="Arial" w:hAnsi="Arial" w:cs="Arial"/>
-          <w:sz w:val="22"/>
-          <w:szCs w:val="22"/>
-        </w:rPr>
-        <w:t xml:space="preserve"> transformative </w:t>
-      </w:r>
-      <w:proofErr w:type="spellStart"/>
-      <w:r>
-        <w:rPr>
-          <w:rFonts w:ascii="Arial" w:eastAsia="Arial" w:hAnsi="Arial" w:cs="Arial"/>
-          <w:sz w:val="22"/>
-          <w:szCs w:val="22"/>
-        </w:rPr>
-        <w:t>value</w:t>
-      </w:r>
-      <w:proofErr w:type="spellEnd"/>
-      <w:r>
-        <w:rPr>
-          <w:rFonts w:ascii="Arial" w:eastAsia="Arial" w:hAnsi="Arial" w:cs="Arial"/>
-          <w:sz w:val="22"/>
-          <w:szCs w:val="22"/>
-        </w:rPr>
-        <w:t xml:space="preserve"> </w:t>
-      </w:r>
-      <w:proofErr w:type="spellStart"/>
-      <w:r>
-        <w:rPr>
-          <w:rFonts w:ascii="Arial" w:eastAsia="Arial" w:hAnsi="Arial" w:cs="Arial"/>
-          <w:sz w:val="22"/>
-          <w:szCs w:val="22"/>
-        </w:rPr>
-        <w:t>for</w:t>
-      </w:r>
-      <w:proofErr w:type="spellEnd"/>
-      <w:r>
-        <w:rPr>
-          <w:rFonts w:ascii="Arial" w:eastAsia="Arial" w:hAnsi="Arial" w:cs="Arial"/>
-          <w:sz w:val="22"/>
-          <w:szCs w:val="22"/>
-        </w:rPr>
-        <w:t xml:space="preserve"> digital </w:t>
-      </w:r>
-      <w:proofErr w:type="spellStart"/>
-      <w:r>
-        <w:rPr>
-          <w:rFonts w:ascii="Arial" w:eastAsia="Arial" w:hAnsi="Arial" w:cs="Arial"/>
-          <w:sz w:val="22"/>
-          <w:szCs w:val="22"/>
-        </w:rPr>
-        <w:t>platforms</w:t>
-      </w:r>
-      <w:proofErr w:type="spellEnd"/>
-      <w:r>
-        <w:rPr>
-          <w:rFonts w:ascii="Arial" w:eastAsia="Arial" w:hAnsi="Arial" w:cs="Arial"/>
-          <w:sz w:val="22"/>
-          <w:szCs w:val="22"/>
-        </w:rPr>
-        <w:t xml:space="preserve">. </w:t>
-      </w:r>
-      <w:proofErr w:type="spellStart"/>
-      <w:r>
-        <w:rPr>
-          <w:rFonts w:ascii="Arial" w:eastAsia="Arial" w:hAnsi="Arial" w:cs="Arial"/>
-          <w:i/>
-          <w:iCs/>
-          <w:sz w:val="22"/>
-          <w:szCs w:val="22"/>
-        </w:rPr>
-        <w:t>Journal</w:t>
-      </w:r>
-      <w:proofErr w:type="spellEnd"/>
-      <w:r>
-        <w:rPr>
-          <w:rFonts w:ascii="Arial" w:eastAsia="Arial" w:hAnsi="Arial" w:cs="Arial"/>
-          <w:i/>
-          <w:iCs/>
-          <w:sz w:val="22"/>
-          <w:szCs w:val="22"/>
-        </w:rPr>
-        <w:t xml:space="preserve"> </w:t>
-      </w:r>
-      <w:proofErr w:type="spellStart"/>
-      <w:r>
-        <w:rPr>
-          <w:rFonts w:ascii="Arial" w:eastAsia="Arial" w:hAnsi="Arial" w:cs="Arial"/>
-          <w:i/>
-          <w:iCs/>
-          <w:sz w:val="22"/>
-          <w:szCs w:val="22"/>
-        </w:rPr>
-        <w:t>of</w:t>
-      </w:r>
-      <w:proofErr w:type="spellEnd"/>
-      <w:r>
-        <w:rPr>
-          <w:rFonts w:ascii="Arial" w:eastAsia="Arial" w:hAnsi="Arial" w:cs="Arial"/>
-          <w:i/>
-          <w:iCs/>
-          <w:sz w:val="22"/>
-          <w:szCs w:val="22"/>
-        </w:rPr>
-        <w:t xml:space="preserve"> Management </w:t>
-      </w:r>
-      <w:proofErr w:type="spellStart"/>
-      <w:r>
-        <w:rPr>
-          <w:rFonts w:ascii="Arial" w:eastAsia="Arial" w:hAnsi="Arial" w:cs="Arial"/>
-          <w:i/>
-          <w:iCs/>
-          <w:sz w:val="22"/>
-          <w:szCs w:val="22"/>
-        </w:rPr>
-        <w:t>Information</w:t>
-      </w:r>
-      <w:proofErr w:type="spellEnd"/>
-      <w:r>
-        <w:rPr>
-          <w:rFonts w:ascii="Arial" w:eastAsia="Arial" w:hAnsi="Arial" w:cs="Arial"/>
-          <w:i/>
-          <w:iCs/>
-          <w:sz w:val="22"/>
-          <w:szCs w:val="22"/>
-        </w:rPr>
-        <w:t xml:space="preserve"> </w:t>
-      </w:r>
-      <w:proofErr w:type="spellStart"/>
-      <w:r>
-        <w:rPr>
-          <w:rFonts w:ascii="Arial" w:eastAsia="Arial" w:hAnsi="Arial" w:cs="Arial"/>
-          <w:i/>
-          <w:iCs/>
-          <w:sz w:val="22"/>
-          <w:szCs w:val="22"/>
-        </w:rPr>
-        <w:t>Systems</w:t>
-      </w:r>
-      <w:proofErr w:type="spellEnd"/>
-      <w:r>
-        <w:rPr>
-          <w:rFonts w:ascii="Arial" w:eastAsia="Arial" w:hAnsi="Arial" w:cs="Arial"/>
-          <w:sz w:val="22"/>
-          <w:szCs w:val="22"/>
-        </w:rPr>
-        <w:t xml:space="preserve">, </w:t>
-      </w:r>
-      <w:r>
-        <w:rPr>
-          <w:rFonts w:ascii="Arial" w:eastAsia="Arial" w:hAnsi="Arial" w:cs="Arial"/>
-          <w:i/>
-          <w:iCs/>
-          <w:sz w:val="22"/>
-          <w:szCs w:val="22"/>
-        </w:rPr>
         <w:t>42</w:t>
       </w:r>
       <w:r>
@@ -6003,8 +4251,8 @@
       </w:r>
     </w:p>
     <w:sectPr>
-      <w:headerReference w:type="default" r:id="rId13"/>
-      <w:footerReference w:type="default" r:id="rId14"/>
+      <w:headerReference w:type="default" r:id="rId15"/>
+      <w:footerReference w:type="default" r:id="rId16"/>
       <w:pgSz w:w="12240" w:h="15840"/>
       <w:pgMar w:top="1440" w:right="1440" w:bottom="1440" w:left="1440" w:header="708" w:footer="708" w:gutter="0"/>
       <w:pgNumType w:start="1"/>
@@ -7099,6 +5347,29 @@
       <w:contextualSpacing/>
     </w:pPr>
   </w:style>
+  <w:style w:type="character" w:styleId="Hipervnculo">
+    <w:name w:val="Hyperlink"/>
+    <w:basedOn w:val="Fuentedeprrafopredeter"/>
+    <w:uiPriority w:val="99"/>
+    <w:unhideWhenUsed/>
+    <w:rsid w:val="00CB6317"/>
+    <w:rPr>
+      <w:color w:val="0000FF" w:themeColor="hyperlink"/>
+      <w:u w:val="single"/>
+    </w:rPr>
+  </w:style>
+  <w:style w:type="character" w:styleId="Mencinsinresolver">
+    <w:name w:val="Unresolved Mention"/>
+    <w:basedOn w:val="Fuentedeprrafopredeter"/>
+    <w:uiPriority w:val="99"/>
+    <w:semiHidden/>
+    <w:unhideWhenUsed/>
+    <w:rsid w:val="00CB6317"/>
+    <w:rPr>
+      <w:color w:val="605E5C"/>
+      <w:shd w:val="clear" w:color="auto" w:fill="E1DFDD"/>
+    </w:rPr>
+  </w:style>
 </w:styles>
 </file>
 

</xml_diff>